<commit_message>
Sincroniza .docx de 8 arquivos alterados/criados no ciclo de gaps
Regenera os 6 .docx cujos .md foram modificados (AQU + OSW):
ADAP-PROFARMA01-001, ADAP-GASMIG02-001/002, ADAP-FRUKI01-001/002,
PRO-OSW-002.

Cria os 2 .docx que não tinham par Word:
GQA-ORG-001 (v1.1 — agora com auditoria de AQU e OSW),
REG-OSW-001 (novo — Painel de Portfólio).

Conteúdo verificado: todos os 8 arquivos Word contêm os termos críticos
esperados (não-aplicabilidade de AQU, referências ao REG-OSW-001,
seções §3.6 e §3.7 do GQA, dados dos 4 projetos no painel).

https://claude.ai/code/session_011KXfcc9u9SbkrrmomU4zNq
</commit_message>
<xml_diff>
--- a/mps-nivel-c/oficial/00_governanca/PRO-OSW-002_Gestao-de-Portfolio-de-Projetos.docx
+++ b/mps-nivel-c/oficial/00_governanca/PRO-OSW-002_Gestao-de-Portfolio-de-Projetos.docx
@@ -4,78 +4,32 @@
   <w:body>
     <w:p>
       <w:pPr>
-        <w:pBdr>
-          <w:top w:val="single" w:sz="32" w:space="0" w:color="003366"/>
-        </w:pBdr>
-        <w:spacing w:before="0" w:after="0"/>
-      </w:pPr>
-    </w:p>
-    <w:p>
-      <w:pPr>
-        <w:spacing w:before="240" w:after="40"/>
+        <w:pStyle w:val="Heading1"/>
       </w:pPr>
       <w:r>
         <w:rPr>
-          <w:rFonts w:ascii="Calibri" w:hAnsi="Calibri"/>
           <w:b/>
-          <w:color w:val="003366"/>
-          <w:sz w:val="36"/>
+          <w:color w:val="1F497D"/>
+          <w:sz w:val="32"/>
         </w:rPr>
-        <w:t>GESTÃO DE PORTFÓLIO DE PROJETOS</w:t>
+        <w:t>Gestão de Portfólio de Projetos — TIMEWARE</w:t>
       </w:r>
-    </w:p>
-    <w:p>
-      <w:pPr>
-        <w:spacing w:before="0" w:after="40"/>
-      </w:pPr>
-      <w:r>
-        <w:rPr>
-          <w:rFonts w:ascii="Calibri" w:hAnsi="Calibri"/>
-          <w:color w:val="555555"/>
-          <w:sz w:val="20"/>
-        </w:rPr>
-        <w:t>PRO-OSW-002   ·   Versão Data   ·   20/03/2026   ·   Timeware Brasil</w:t>
-      </w:r>
-    </w:p>
-    <w:p>
-      <w:pPr>
-        <w:pBdr>
-          <w:bottom w:val="single" w:sz="6" w:space="1" w:color="003366"/>
-        </w:pBdr>
-        <w:spacing w:before="120" w:after="280"/>
-      </w:pPr>
     </w:p>
     <w:tbl>
       <w:tblPr>
+        <w:tblStyle w:val="TableGrid"/>
         <w:tblW w:type="auto" w:w="0"/>
         <w:tblLook w:firstColumn="1" w:firstRow="1" w:lastColumn="0" w:lastRow="0" w:noHBand="0" w:noVBand="1" w:val="04A0"/>
-        <w:tblBorders>
-          <w:top w:val="single" w:sz="4" w:space="0" w:color="AAAAAA"/>
-          <w:left w:val="single" w:sz="4" w:space="0" w:color="AAAAAA"/>
-          <w:bottom w:val="single" w:sz="4" w:space="0" w:color="AAAAAA"/>
-          <w:right w:val="single" w:sz="4" w:space="0" w:color="AAAAAA"/>
-          <w:insideH w:val="single" w:sz="4" w:space="0" w:color="AAAAAA"/>
-          <w:insideV w:val="single" w:sz="4" w:space="0" w:color="AAAAAA"/>
-        </w:tblBorders>
       </w:tblPr>
       <w:tblGrid>
-        <w:gridCol w:w="4451"/>
-        <w:gridCol w:w="4451"/>
+        <w:gridCol w:w="4680"/>
+        <w:gridCol w:w="4680"/>
       </w:tblGrid>
       <w:tr>
-        <w:trPr>
-          <w:cantSplit w:val="1"/>
-        </w:trPr>
         <w:tc>
           <w:tcPr>
-            <w:tcW w:type="dxa" w:w="4451"/>
-            <w:tcMar>
-              <w:top w:w="60" w:type="dxa"/>
-              <w:bottom w:w="60" w:type="dxa"/>
-              <w:left w:w="100" w:type="dxa"/>
-              <w:right w:w="100" w:type="dxa"/>
-            </w:tcMar>
-            <w:shd w:val="clear" w:color="auto" w:fill="D6E4F0"/>
+            <w:tcW w:type="dxa" w:w="4680"/>
+            <w:shd w:val="clear" w:color="auto" w:fill="D6E4F7"/>
           </w:tcPr>
           <w:p>
             <w:pPr>
@@ -83,7 +37,11 @@
             </w:pPr>
             <w:r>
               <w:rPr>
-                <w:rFonts w:ascii="Calibri" w:hAnsi="Calibri"/>
+                <w:b/>
+              </w:rPr>
+            </w:r>
+            <w:r>
+              <w:rPr>
                 <w:b/>
                 <w:i w:val="0"/>
                 <w:sz w:val="20"/>
@@ -94,14 +52,8 @@
         </w:tc>
         <w:tc>
           <w:tcPr>
-            <w:tcW w:type="dxa" w:w="4451"/>
-            <w:tcMar>
-              <w:top w:w="60" w:type="dxa"/>
-              <w:bottom w:w="60" w:type="dxa"/>
-              <w:left w:w="100" w:type="dxa"/>
-              <w:right w:w="100" w:type="dxa"/>
-            </w:tcMar>
-            <w:shd w:val="clear" w:color="auto" w:fill="D6E4F0"/>
+            <w:tcW w:type="dxa" w:w="4680"/>
+            <w:shd w:val="clear" w:color="auto" w:fill="D6E4F7"/>
           </w:tcPr>
           <w:p>
             <w:pPr>
@@ -109,7 +61,11 @@
             </w:pPr>
             <w:r>
               <w:rPr>
-                <w:rFonts w:ascii="Calibri" w:hAnsi="Calibri"/>
+                <w:b/>
+              </w:rPr>
+            </w:r>
+            <w:r>
+              <w:rPr>
                 <w:b/>
                 <w:i w:val="0"/>
                 <w:sz w:val="20"/>
@@ -120,27 +76,17 @@
         </w:tc>
       </w:tr>
       <w:tr>
-        <w:trPr>
-          <w:cantSplit w:val="1"/>
-        </w:trPr>
         <w:tc>
           <w:tcPr>
-            <w:tcW w:type="dxa" w:w="4451"/>
-            <w:tcMar>
-              <w:top w:w="60" w:type="dxa"/>
-              <w:bottom w:w="60" w:type="dxa"/>
-              <w:left w:w="100" w:type="dxa"/>
-              <w:right w:w="100" w:type="dxa"/>
-            </w:tcMar>
-            <w:shd w:val="clear" w:color="auto" w:fill="F0F4F8"/>
+            <w:tcW w:type="dxa" w:w="4680"/>
           </w:tcPr>
           <w:p>
             <w:pPr>
               <w:spacing w:before="40" w:after="40"/>
             </w:pPr>
+            <w:r/>
             <w:r>
               <w:rPr>
-                <w:rFonts w:ascii="Calibri" w:hAnsi="Calibri"/>
                 <w:b/>
                 <w:i w:val="0"/>
                 <w:sz w:val="20"/>
@@ -151,21 +97,15 @@
         </w:tc>
         <w:tc>
           <w:tcPr>
-            <w:tcW w:type="dxa" w:w="4451"/>
-            <w:tcMar>
-              <w:top w:w="60" w:type="dxa"/>
-              <w:bottom w:w="60" w:type="dxa"/>
-              <w:left w:w="100" w:type="dxa"/>
-              <w:right w:w="100" w:type="dxa"/>
-            </w:tcMar>
+            <w:tcW w:type="dxa" w:w="4680"/>
           </w:tcPr>
           <w:p>
             <w:pPr>
               <w:spacing w:before="40" w:after="40"/>
             </w:pPr>
+            <w:r/>
             <w:r>
               <w:rPr>
-                <w:rFonts w:ascii="Calibri" w:hAnsi="Calibri"/>
                 <w:b w:val="0"/>
                 <w:i w:val="0"/>
                 <w:sz w:val="20"/>
@@ -176,27 +116,17 @@
         </w:tc>
       </w:tr>
       <w:tr>
-        <w:trPr>
-          <w:cantSplit w:val="1"/>
-        </w:trPr>
         <w:tc>
           <w:tcPr>
-            <w:tcW w:type="dxa" w:w="4451"/>
-            <w:tcMar>
-              <w:top w:w="60" w:type="dxa"/>
-              <w:bottom w:w="60" w:type="dxa"/>
-              <w:left w:w="100" w:type="dxa"/>
-              <w:right w:w="100" w:type="dxa"/>
-            </w:tcMar>
-            <w:shd w:val="clear" w:color="auto" w:fill="F0F4F8"/>
+            <w:tcW w:type="dxa" w:w="4680"/>
           </w:tcPr>
           <w:p>
             <w:pPr>
               <w:spacing w:before="40" w:after="40"/>
             </w:pPr>
+            <w:r/>
             <w:r>
               <w:rPr>
-                <w:rFonts w:ascii="Calibri" w:hAnsi="Calibri"/>
                 <w:b/>
                 <w:i w:val="0"/>
                 <w:sz w:val="20"/>
@@ -207,52 +137,36 @@
         </w:tc>
         <w:tc>
           <w:tcPr>
-            <w:tcW w:type="dxa" w:w="4451"/>
-            <w:tcMar>
-              <w:top w:w="60" w:type="dxa"/>
-              <w:bottom w:w="60" w:type="dxa"/>
-              <w:left w:w="100" w:type="dxa"/>
-              <w:right w:w="100" w:type="dxa"/>
-            </w:tcMar>
+            <w:tcW w:type="dxa" w:w="4680"/>
           </w:tcPr>
           <w:p>
             <w:pPr>
               <w:spacing w:before="40" w:after="40"/>
             </w:pPr>
+            <w:r/>
             <w:r>
               <w:rPr>
-                <w:rFonts w:ascii="Calibri" w:hAnsi="Calibri"/>
                 <w:b w:val="0"/>
                 <w:i w:val="0"/>
                 <w:sz w:val="20"/>
               </w:rPr>
-              <w:t>1.2</w:t>
+              <w:t>1.3</w:t>
             </w:r>
           </w:p>
         </w:tc>
       </w:tr>
       <w:tr>
-        <w:trPr>
-          <w:cantSplit w:val="1"/>
-        </w:trPr>
         <w:tc>
           <w:tcPr>
-            <w:tcW w:type="dxa" w:w="4451"/>
-            <w:tcMar>
-              <w:top w:w="60" w:type="dxa"/>
-              <w:bottom w:w="60" w:type="dxa"/>
-              <w:left w:w="100" w:type="dxa"/>
-              <w:right w:w="100" w:type="dxa"/>
-            </w:tcMar>
-            <w:shd w:val="clear" w:color="auto" w:fill="F0F4F8"/>
+            <w:tcW w:type="dxa" w:w="4680"/>
           </w:tcPr>
           <w:p>
             <w:pPr>
               <w:spacing w:before="40" w:after="40"/>
             </w:pPr>
+            <w:r/>
             <w:r>
               <w:rPr>
-                <w:rFonts w:ascii="Calibri" w:hAnsi="Calibri"/>
                 <w:b/>
                 <w:i w:val="0"/>
                 <w:sz w:val="20"/>
@@ -263,52 +177,36 @@
         </w:tc>
         <w:tc>
           <w:tcPr>
-            <w:tcW w:type="dxa" w:w="4451"/>
-            <w:tcMar>
-              <w:top w:w="60" w:type="dxa"/>
-              <w:bottom w:w="60" w:type="dxa"/>
-              <w:left w:w="100" w:type="dxa"/>
-              <w:right w:w="100" w:type="dxa"/>
-            </w:tcMar>
+            <w:tcW w:type="dxa" w:w="4680"/>
           </w:tcPr>
           <w:p>
             <w:pPr>
               <w:spacing w:before="40" w:after="40"/>
             </w:pPr>
+            <w:r/>
             <w:r>
               <w:rPr>
-                <w:rFonts w:ascii="Calibri" w:hAnsi="Calibri"/>
                 <w:b w:val="0"/>
                 <w:i w:val="0"/>
                 <w:sz w:val="20"/>
               </w:rPr>
-              <w:t>20/03/2026</w:t>
+              <w:t>13/06/2026</w:t>
             </w:r>
           </w:p>
         </w:tc>
       </w:tr>
       <w:tr>
-        <w:trPr>
-          <w:cantSplit w:val="1"/>
-        </w:trPr>
         <w:tc>
           <w:tcPr>
-            <w:tcW w:type="dxa" w:w="4451"/>
-            <w:tcMar>
-              <w:top w:w="60" w:type="dxa"/>
-              <w:bottom w:w="60" w:type="dxa"/>
-              <w:left w:w="100" w:type="dxa"/>
-              <w:right w:w="100" w:type="dxa"/>
-            </w:tcMar>
-            <w:shd w:val="clear" w:color="auto" w:fill="F0F4F8"/>
+            <w:tcW w:type="dxa" w:w="4680"/>
           </w:tcPr>
           <w:p>
             <w:pPr>
               <w:spacing w:before="40" w:after="40"/>
             </w:pPr>
+            <w:r/>
             <w:r>
               <w:rPr>
-                <w:rFonts w:ascii="Calibri" w:hAnsi="Calibri"/>
                 <w:b/>
                 <w:i w:val="0"/>
                 <w:sz w:val="20"/>
@@ -319,21 +217,15 @@
         </w:tc>
         <w:tc>
           <w:tcPr>
-            <w:tcW w:type="dxa" w:w="4451"/>
-            <w:tcMar>
-              <w:top w:w="60" w:type="dxa"/>
-              <w:bottom w:w="60" w:type="dxa"/>
-              <w:left w:w="100" w:type="dxa"/>
-              <w:right w:w="100" w:type="dxa"/>
-            </w:tcMar>
+            <w:tcW w:type="dxa" w:w="4680"/>
           </w:tcPr>
           <w:p>
             <w:pPr>
               <w:spacing w:before="40" w:after="40"/>
             </w:pPr>
+            <w:r/>
             <w:r>
               <w:rPr>
-                <w:rFonts w:ascii="Calibri" w:hAnsi="Calibri"/>
                 <w:b w:val="0"/>
                 <w:i w:val="0"/>
                 <w:sz w:val="20"/>
@@ -344,27 +236,17 @@
         </w:tc>
       </w:tr>
       <w:tr>
-        <w:trPr>
-          <w:cantSplit w:val="1"/>
-        </w:trPr>
         <w:tc>
           <w:tcPr>
-            <w:tcW w:type="dxa" w:w="4451"/>
-            <w:tcMar>
-              <w:top w:w="60" w:type="dxa"/>
-              <w:bottom w:w="60" w:type="dxa"/>
-              <w:left w:w="100" w:type="dxa"/>
-              <w:right w:w="100" w:type="dxa"/>
-            </w:tcMar>
-            <w:shd w:val="clear" w:color="auto" w:fill="F0F4F8"/>
+            <w:tcW w:type="dxa" w:w="4680"/>
           </w:tcPr>
           <w:p>
             <w:pPr>
               <w:spacing w:before="40" w:after="40"/>
             </w:pPr>
+            <w:r/>
             <w:r>
               <w:rPr>
-                <w:rFonts w:ascii="Calibri" w:hAnsi="Calibri"/>
                 <w:b/>
                 <w:i w:val="0"/>
                 <w:sz w:val="20"/>
@@ -375,21 +257,15 @@
         </w:tc>
         <w:tc>
           <w:tcPr>
-            <w:tcW w:type="dxa" w:w="4451"/>
-            <w:tcMar>
-              <w:top w:w="60" w:type="dxa"/>
-              <w:bottom w:w="60" w:type="dxa"/>
-              <w:left w:w="100" w:type="dxa"/>
-              <w:right w:w="100" w:type="dxa"/>
-            </w:tcMar>
+            <w:tcW w:type="dxa" w:w="4680"/>
           </w:tcPr>
           <w:p>
             <w:pPr>
               <w:spacing w:before="40" w:after="40"/>
             </w:pPr>
+            <w:r/>
             <w:r>
               <w:rPr>
-                <w:rFonts w:ascii="Calibri" w:hAnsi="Calibri"/>
                 <w:b w:val="0"/>
                 <w:i w:val="0"/>
                 <w:sz w:val="20"/>
@@ -400,27 +276,17 @@
         </w:tc>
       </w:tr>
       <w:tr>
-        <w:trPr>
-          <w:cantSplit w:val="1"/>
-        </w:trPr>
         <w:tc>
           <w:tcPr>
-            <w:tcW w:type="dxa" w:w="4451"/>
-            <w:tcMar>
-              <w:top w:w="60" w:type="dxa"/>
-              <w:bottom w:w="60" w:type="dxa"/>
-              <w:left w:w="100" w:type="dxa"/>
-              <w:right w:w="100" w:type="dxa"/>
-            </w:tcMar>
-            <w:shd w:val="clear" w:color="auto" w:fill="F0F4F8"/>
+            <w:tcW w:type="dxa" w:w="4680"/>
           </w:tcPr>
           <w:p>
             <w:pPr>
               <w:spacing w:before="40" w:after="40"/>
             </w:pPr>
+            <w:r/>
             <w:r>
               <w:rPr>
-                <w:rFonts w:ascii="Calibri" w:hAnsi="Calibri"/>
                 <w:b/>
                 <w:i w:val="0"/>
                 <w:sz w:val="20"/>
@@ -431,21 +297,15 @@
         </w:tc>
         <w:tc>
           <w:tcPr>
-            <w:tcW w:type="dxa" w:w="4451"/>
-            <w:tcMar>
-              <w:top w:w="60" w:type="dxa"/>
-              <w:bottom w:w="60" w:type="dxa"/>
-              <w:left w:w="100" w:type="dxa"/>
-              <w:right w:w="100" w:type="dxa"/>
-            </w:tcMar>
+            <w:tcW w:type="dxa" w:w="4680"/>
           </w:tcPr>
           <w:p>
             <w:pPr>
               <w:spacing w:before="40" w:after="40"/>
             </w:pPr>
+            <w:r/>
             <w:r>
               <w:rPr>
-                <w:rFonts w:ascii="Calibri" w:hAnsi="Calibri"/>
                 <w:b w:val="0"/>
                 <w:i w:val="0"/>
                 <w:sz w:val="20"/>
@@ -456,27 +316,17 @@
         </w:tc>
       </w:tr>
       <w:tr>
-        <w:trPr>
-          <w:cantSplit w:val="1"/>
-        </w:trPr>
         <w:tc>
           <w:tcPr>
-            <w:tcW w:type="dxa" w:w="4451"/>
-            <w:tcMar>
-              <w:top w:w="60" w:type="dxa"/>
-              <w:bottom w:w="60" w:type="dxa"/>
-              <w:left w:w="100" w:type="dxa"/>
-              <w:right w:w="100" w:type="dxa"/>
-            </w:tcMar>
-            <w:shd w:val="clear" w:color="auto" w:fill="F0F4F8"/>
+            <w:tcW w:type="dxa" w:w="4680"/>
           </w:tcPr>
           <w:p>
             <w:pPr>
               <w:spacing w:before="40" w:after="40"/>
             </w:pPr>
+            <w:r/>
             <w:r>
               <w:rPr>
-                <w:rFonts w:ascii="Calibri" w:hAnsi="Calibri"/>
                 <w:b/>
                 <w:i w:val="0"/>
                 <w:sz w:val="20"/>
@@ -487,21 +337,15 @@
         </w:tc>
         <w:tc>
           <w:tcPr>
-            <w:tcW w:type="dxa" w:w="4451"/>
-            <w:tcMar>
-              <w:top w:w="60" w:type="dxa"/>
-              <w:bottom w:w="60" w:type="dxa"/>
-              <w:left w:w="100" w:type="dxa"/>
-              <w:right w:w="100" w:type="dxa"/>
-            </w:tcMar>
+            <w:tcW w:type="dxa" w:w="4680"/>
           </w:tcPr>
           <w:p>
             <w:pPr>
               <w:spacing w:before="40" w:after="40"/>
             </w:pPr>
+            <w:r/>
             <w:r>
               <w:rPr>
-                <w:rFonts w:ascii="Calibri" w:hAnsi="Calibri"/>
                 <w:b w:val="0"/>
                 <w:i w:val="0"/>
                 <w:sz w:val="20"/>
@@ -512,142 +356,136 @@
         </w:tc>
       </w:tr>
     </w:tbl>
+    <w:p/>
     <w:p>
       <w:pPr>
-        <w:spacing w:before="0" w:after="160"/>
+        <w:pBdr>
+          <w:bottom w:val="single" w:sz="6" w:space="1" w:color="AAAAAA"/>
+        </w:pBdr>
       </w:pPr>
     </w:p>
     <w:p>
       <w:pPr>
-        <w:pStyle w:val="Heading1"/>
-        <w:keepNext/>
-        <w:keepLines/>
-        <w:pBdr>
-          <w:bottom w:val="single" w:sz="4" w:space="2" w:color="D6E4F0"/>
-        </w:pBdr>
+        <w:pStyle w:val="Heading2"/>
       </w:pPr>
       <w:r>
+        <w:rPr>
+          <w:b/>
+          <w:color w:val="2E74B5"/>
+          <w:sz w:val="26"/>
+        </w:rPr>
         <w:t>1. Propósito</w:t>
       </w:r>
     </w:p>
     <w:p>
       <w:pPr>
-        <w:spacing w:before="0" w:after="120"/>
+        <w:spacing w:after="80"/>
       </w:pPr>
       <w:r>
         <w:rPr>
-          <w:rFonts w:ascii="Calibri" w:hAnsi="Calibri"/>
           <w:b w:val="0"/>
           <w:i w:val="0"/>
-          <w:sz w:val="22"/>
+          <w:sz w:val="20"/>
         </w:rPr>
         <w:t xml:space="preserve">Este documento define como a Timeware gerencia seu </w:t>
       </w:r>
       <w:r>
         <w:rPr>
-          <w:rFonts w:ascii="Calibri" w:hAnsi="Calibri"/>
           <w:b/>
           <w:i w:val="0"/>
-          <w:sz w:val="22"/>
+          <w:sz w:val="20"/>
         </w:rPr>
         <w:t>portfólio de projetos</w:t>
       </w:r>
       <w:r>
         <w:rPr>
-          <w:rFonts w:ascii="Calibri" w:hAnsi="Calibri"/>
           <w:b w:val="0"/>
           <w:i w:val="0"/>
-          <w:sz w:val="22"/>
+          <w:sz w:val="20"/>
         </w:rPr>
         <w:t xml:space="preserve"> — o conjunto de projetos em andamento, olhados de forma consolidada — priorizando oportunidades, alocando recursos compartilhados e acompanhando os projetos quanto aos compromissos assumidos. A gestão do portfólio é responsabilidade das Operações (COO), por meio do escritório de portfólio de projetos.</w:t>
       </w:r>
     </w:p>
     <w:p>
       <w:pPr>
-        <w:pStyle w:val="Heading1"/>
-        <w:keepNext/>
-        <w:keepLines/>
-        <w:pBdr>
-          <w:bottom w:val="single" w:sz="4" w:space="2" w:color="D6E4F0"/>
-        </w:pBdr>
+        <w:pStyle w:val="Heading2"/>
       </w:pPr>
       <w:r>
+        <w:rPr>
+          <w:b/>
+          <w:color w:val="2E74B5"/>
+          <w:sz w:val="26"/>
+        </w:rPr>
         <w:t>2. Contexto</w:t>
       </w:r>
     </w:p>
     <w:p>
       <w:pPr>
-        <w:spacing w:before="0" w:after="120"/>
+        <w:spacing w:after="80"/>
       </w:pPr>
       <w:r>
         <w:rPr>
-          <w:rFonts w:ascii="Calibri" w:hAnsi="Calibri"/>
           <w:b w:val="0"/>
           <w:i w:val="0"/>
-          <w:sz w:val="22"/>
+          <w:sz w:val="20"/>
         </w:rPr>
         <w:t xml:space="preserve">A Timeware conduz múltiplos projetos de software sob medida simultaneamente. Alguns recursos são </w:t>
       </w:r>
       <w:r>
         <w:rPr>
-          <w:rFonts w:ascii="Calibri" w:hAnsi="Calibri"/>
           <w:b/>
           <w:i w:val="0"/>
-          <w:sz w:val="22"/>
+          <w:sz w:val="20"/>
         </w:rPr>
         <w:t>dedicados a um único projeto</w:t>
       </w:r>
       <w:r>
         <w:rPr>
-          <w:rFonts w:ascii="Calibri" w:hAnsi="Calibri"/>
           <w:b w:val="0"/>
           <w:i w:val="0"/>
-          <w:sz w:val="22"/>
+          <w:sz w:val="20"/>
         </w:rPr>
         <w:t xml:space="preserve"> (por exemplo, desenvolvedores), enquanto outros são </w:t>
       </w:r>
       <w:r>
         <w:rPr>
-          <w:rFonts w:ascii="Calibri" w:hAnsi="Calibri"/>
           <w:b/>
           <w:i w:val="0"/>
-          <w:sz w:val="22"/>
+          <w:sz w:val="20"/>
         </w:rPr>
         <w:t>compartilhados entre projetos</w:t>
       </w:r>
       <w:r>
         <w:rPr>
-          <w:rFonts w:ascii="Calibri" w:hAnsi="Calibri"/>
           <w:b w:val="0"/>
           <w:i w:val="0"/>
-          <w:sz w:val="22"/>
+          <w:sz w:val="20"/>
         </w:rPr>
         <w:t xml:space="preserve"> — notadamente Tech Lead, Arquiteto e Product Owner. Essa característica cria a necessidade de gerenciar o portfólio, equilibrando a demanda dos projetos com a capacidade disponível desses recursos compartilhados.</w:t>
       </w:r>
     </w:p>
     <w:p>
       <w:pPr>
-        <w:pStyle w:val="Heading1"/>
-        <w:keepNext/>
-        <w:keepLines/>
-        <w:pBdr>
-          <w:bottom w:val="single" w:sz="4" w:space="2" w:color="D6E4F0"/>
-        </w:pBdr>
+        <w:pStyle w:val="Heading2"/>
       </w:pPr>
       <w:r>
+        <w:rPr>
+          <w:b/>
+          <w:color w:val="2E74B5"/>
+          <w:sz w:val="26"/>
+        </w:rPr>
         <w:t>3. Priorização de oportunidades e projetos</w:t>
       </w:r>
     </w:p>
     <w:p>
       <w:pPr>
-        <w:spacing w:before="0" w:after="120"/>
+        <w:spacing w:after="80"/>
       </w:pPr>
       <w:r>
         <w:rPr>
-          <w:rFonts w:ascii="Calibri" w:hAnsi="Calibri"/>
           <w:b w:val="0"/>
           <w:i w:val="0"/>
-          <w:sz w:val="22"/>
+          <w:sz w:val="20"/>
         </w:rPr>
         <w:t>As oportunidades de negócio e os projetos são priorizados pelo COO (Operações), considerando critérios como:</w:t>
       </w:r>
@@ -655,14 +493,13 @@
     <w:p>
       <w:pPr>
         <w:pStyle w:val="ListBullet"/>
-        <w:spacing w:before="20" w:after="40"/>
+        <w:spacing w:before="0" w:after="0"/>
       </w:pPr>
       <w:r>
         <w:rPr>
-          <w:rFonts w:ascii="Calibri" w:hAnsi="Calibri"/>
           <w:b w:val="0"/>
           <w:i w:val="0"/>
-          <w:sz w:val="22"/>
+          <w:sz w:val="20"/>
         </w:rPr>
         <w:t>alinhamento com os objetivos de negócio (crescer com qualidade e previsibilidade);</w:t>
       </w:r>
@@ -670,14 +507,13 @@
     <w:p>
       <w:pPr>
         <w:pStyle w:val="ListBullet"/>
-        <w:spacing w:before="20" w:after="40"/>
+        <w:spacing w:before="0" w:after="0"/>
       </w:pPr>
       <w:r>
         <w:rPr>
-          <w:rFonts w:ascii="Calibri" w:hAnsi="Calibri"/>
           <w:b w:val="0"/>
           <w:i w:val="0"/>
-          <w:sz w:val="22"/>
+          <w:sz w:val="20"/>
         </w:rPr>
         <w:t>compromissos contratuais e prazos com clientes;</w:t>
       </w:r>
@@ -685,14 +521,13 @@
     <w:p>
       <w:pPr>
         <w:pStyle w:val="ListBullet"/>
-        <w:spacing w:before="20" w:after="40"/>
+        <w:spacing w:before="0" w:after="0"/>
       </w:pPr>
       <w:r>
         <w:rPr>
-          <w:rFonts w:ascii="Calibri" w:hAnsi="Calibri"/>
           <w:b w:val="0"/>
           <w:i w:val="0"/>
-          <w:sz w:val="22"/>
+          <w:sz w:val="20"/>
         </w:rPr>
         <w:t>disponibilidade de recursos, especialmente os compartilhados;</w:t>
       </w:r>
@@ -700,97 +535,94 @@
     <w:p>
       <w:pPr>
         <w:pStyle w:val="ListBullet"/>
-        <w:spacing w:before="20" w:after="40"/>
+        <w:spacing w:before="0" w:after="0"/>
       </w:pPr>
       <w:r>
         <w:rPr>
-          <w:rFonts w:ascii="Calibri" w:hAnsi="Calibri"/>
           <w:b w:val="0"/>
           <w:i w:val="0"/>
-          <w:sz w:val="22"/>
+          <w:sz w:val="20"/>
         </w:rPr>
         <w:t>retorno e relevância estratégica.</w:t>
       </w:r>
     </w:p>
     <w:p>
       <w:pPr>
-        <w:spacing w:before="0" w:after="120"/>
+        <w:spacing w:after="80"/>
       </w:pPr>
       <w:r>
         <w:rPr>
-          <w:rFonts w:ascii="Calibri" w:hAnsi="Calibri"/>
           <w:b w:val="0"/>
           <w:i w:val="0"/>
-          <w:sz w:val="22"/>
+          <w:sz w:val="20"/>
         </w:rPr>
         <w:t>A priorização define quais projetos a organização assume e em que ordem de prioridade, de forma que os compromissos assumidos sejam compatíveis com a capacidade real da organização.</w:t>
       </w:r>
     </w:p>
     <w:p>
       <w:pPr>
-        <w:pStyle w:val="Heading1"/>
-        <w:keepNext/>
-        <w:keepLines/>
-        <w:pBdr>
-          <w:bottom w:val="single" w:sz="4" w:space="2" w:color="D6E4F0"/>
-        </w:pBdr>
+        <w:pStyle w:val="Heading2"/>
       </w:pPr>
       <w:r>
+        <w:rPr>
+          <w:b/>
+          <w:color w:val="2E74B5"/>
+          <w:sz w:val="26"/>
+        </w:rPr>
         <w:t>4. Recursos, capacidade e autoridade</w:t>
       </w:r>
     </w:p>
     <w:p>
       <w:pPr>
-        <w:pStyle w:val="Heading2"/>
-        <w:keepNext/>
-        <w:keepLines/>
+        <w:pStyle w:val="Heading3"/>
       </w:pPr>
       <w:r>
+        <w:rPr>
+          <w:b/>
+          <w:color w:val="1F497D"/>
+          <w:sz w:val="22"/>
+        </w:rPr>
         <w:t>4.1. Gestão de capacidade (capacity)</w:t>
       </w:r>
     </w:p>
     <w:p>
       <w:pPr>
-        <w:spacing w:before="0" w:after="120"/>
+        <w:spacing w:after="80"/>
       </w:pPr>
       <w:r>
         <w:rPr>
-          <w:rFonts w:ascii="Calibri" w:hAnsi="Calibri"/>
           <w:b w:val="0"/>
           <w:i w:val="0"/>
-          <w:sz w:val="22"/>
+          <w:sz w:val="20"/>
         </w:rPr>
         <w:t xml:space="preserve">A Timeware mantém um </w:t>
       </w:r>
       <w:r>
         <w:rPr>
-          <w:rFonts w:ascii="Calibri" w:hAnsi="Calibri"/>
           <w:b/>
           <w:i w:val="0"/>
-          <w:sz w:val="22"/>
+          <w:sz w:val="20"/>
         </w:rPr>
         <w:t>quadro de capacity</w:t>
       </w:r>
       <w:r>
         <w:rPr>
-          <w:rFonts w:ascii="Calibri" w:hAnsi="Calibri"/>
           <w:b w:val="0"/>
           <w:i w:val="0"/>
-          <w:sz w:val="22"/>
+          <w:sz w:val="20"/>
         </w:rPr>
         <w:t xml:space="preserve"> que registra a alocação dos recursos compartilhados (Tech Lead, Arquiteto, PO) entre os projetos. O quadro permite visualizar a ocupação desses recursos e identificar conflitos de alocação antes que afetem os projetos.</w:t>
       </w:r>
     </w:p>
     <w:p>
       <w:pPr>
-        <w:spacing w:before="0" w:after="120"/>
+        <w:spacing w:after="80"/>
       </w:pPr>
       <w:r>
         <w:rPr>
-          <w:rFonts w:ascii="Calibri" w:hAnsi="Calibri"/>
           <w:b w:val="0"/>
           <w:i w:val="0"/>
-          <w:sz w:val="22"/>
+          <w:sz w:val="20"/>
         </w:rPr>
         <w:t>Quando a demanda excede a capacidade disponível, a organização atua de duas formas:</w:t>
       </w:r>
@@ -798,23 +630,21 @@
     <w:p>
       <w:pPr>
         <w:pStyle w:val="ListBullet"/>
-        <w:spacing w:before="20" w:after="40"/>
+        <w:spacing w:before="0" w:after="0"/>
       </w:pPr>
       <w:r>
         <w:rPr>
-          <w:rFonts w:ascii="Calibri" w:hAnsi="Calibri"/>
           <w:b/>
           <w:i w:val="0"/>
-          <w:sz w:val="22"/>
+          <w:sz w:val="20"/>
         </w:rPr>
         <w:t>realoca recursos</w:t>
       </w:r>
       <w:r>
         <w:rPr>
-          <w:rFonts w:ascii="Calibri" w:hAnsi="Calibri"/>
           <w:b w:val="0"/>
           <w:i w:val="0"/>
-          <w:sz w:val="22"/>
+          <w:sz w:val="20"/>
         </w:rPr>
         <w:t xml:space="preserve"> de colaboradores da Timeware de fora da unidade, quando disponíveis;</w:t>
       </w:r>
@@ -822,82 +652,65 @@
     <w:p>
       <w:pPr>
         <w:pStyle w:val="ListBullet"/>
-        <w:spacing w:before="20" w:after="40"/>
+        <w:spacing w:before="0" w:after="0"/>
       </w:pPr>
       <w:r>
         <w:rPr>
-          <w:rFonts w:ascii="Calibri" w:hAnsi="Calibri"/>
           <w:b/>
           <w:i w:val="0"/>
-          <w:sz w:val="22"/>
+          <w:sz w:val="20"/>
         </w:rPr>
         <w:t>contrata</w:t>
       </w:r>
       <w:r>
         <w:rPr>
-          <w:rFonts w:ascii="Calibri" w:hAnsi="Calibri"/>
           <w:b w:val="0"/>
           <w:i w:val="0"/>
-          <w:sz w:val="22"/>
+          <w:sz w:val="20"/>
         </w:rPr>
         <w:t xml:space="preserve"> novos recursos, quando necessário.</w:t>
       </w:r>
     </w:p>
     <w:p>
       <w:pPr>
-        <w:pStyle w:val="Heading3"/>
-        <w:keepNext/>
-        <w:keepLines/>
+        <w:pStyle w:val="Heading4"/>
       </w:pPr>
       <w:r>
+        <w:rPr>
+          <w:b/>
+          <w:sz w:val="20"/>
+        </w:rPr>
         <w:t>Estrutura do quadro de capacity</w:t>
       </w:r>
     </w:p>
     <w:p>
       <w:pPr>
-        <w:spacing w:before="0" w:after="120"/>
+        <w:spacing w:after="80"/>
       </w:pPr>
       <w:r>
         <w:rPr>
-          <w:rFonts w:ascii="Calibri" w:hAnsi="Calibri"/>
           <w:b w:val="0"/>
           <w:i w:val="0"/>
-          <w:sz w:val="22"/>
+          <w:sz w:val="20"/>
         </w:rPr>
         <w:t>O quadro de capacity é mantido no Jira (ou página estruturada no Confluence), com os seguintes campos mínimos:</w:t>
       </w:r>
     </w:p>
     <w:tbl>
       <w:tblPr>
+        <w:tblStyle w:val="TableGrid"/>
         <w:tblW w:type="auto" w:w="0"/>
         <w:tblLook w:firstColumn="1" w:firstRow="1" w:lastColumn="0" w:lastRow="0" w:noHBand="0" w:noVBand="1" w:val="04A0"/>
-        <w:tblBorders>
-          <w:top w:val="single" w:sz="4" w:space="0" w:color="003366"/>
-          <w:left w:val="single" w:sz="4" w:space="0" w:color="003366"/>
-          <w:bottom w:val="single" w:sz="4" w:space="0" w:color="003366"/>
-          <w:right w:val="single" w:sz="4" w:space="0" w:color="003366"/>
-          <w:insideH w:val="single" w:sz="4" w:space="0" w:color="003366"/>
-          <w:insideV w:val="single" w:sz="4" w:space="0" w:color="003366"/>
-        </w:tblBorders>
       </w:tblPr>
       <w:tblGrid>
-        <w:gridCol w:w="4451"/>
-        <w:gridCol w:w="4451"/>
+        <w:gridCol w:w="4680"/>
+        <w:gridCol w:w="4680"/>
       </w:tblGrid>
       <w:tr>
-        <w:trPr>
-          <w:cantSplit w:val="1"/>
-        </w:trPr>
         <w:tc>
           <w:tcPr>
-            <w:tcW w:type="dxa" w:w="4451"/>
-            <w:tcMar>
-              <w:top w:w="60" w:type="dxa"/>
-              <w:bottom w:w="60" w:type="dxa"/>
-              <w:left w:w="100" w:type="dxa"/>
-              <w:right w:w="100" w:type="dxa"/>
-            </w:tcMar>
-            <w:shd w:val="clear" w:color="auto" w:fill="003366"/>
+            <w:tcW w:type="dxa" w:w="4680"/>
+            <w:shd w:val="clear" w:color="auto" w:fill="D6E4F7"/>
           </w:tcPr>
           <w:p>
             <w:pPr>
@@ -905,10 +718,13 @@
             </w:pPr>
             <w:r>
               <w:rPr>
-                <w:rFonts w:ascii="Calibri" w:hAnsi="Calibri"/>
+                <w:b/>
+              </w:rPr>
+            </w:r>
+            <w:r>
+              <w:rPr>
                 <w:b/>
                 <w:i w:val="0"/>
-                <w:color w:val="FFFFFF"/>
                 <w:sz w:val="20"/>
               </w:rPr>
               <w:t>Campo</w:t>
@@ -917,14 +733,8 @@
         </w:tc>
         <w:tc>
           <w:tcPr>
-            <w:tcW w:type="dxa" w:w="4451"/>
-            <w:tcMar>
-              <w:top w:w="60" w:type="dxa"/>
-              <w:bottom w:w="60" w:type="dxa"/>
-              <w:left w:w="100" w:type="dxa"/>
-              <w:right w:w="100" w:type="dxa"/>
-            </w:tcMar>
-            <w:shd w:val="clear" w:color="auto" w:fill="003366"/>
+            <w:tcW w:type="dxa" w:w="4680"/>
+            <w:shd w:val="clear" w:color="auto" w:fill="D6E4F7"/>
           </w:tcPr>
           <w:p>
             <w:pPr>
@@ -932,10 +742,13 @@
             </w:pPr>
             <w:r>
               <w:rPr>
-                <w:rFonts w:ascii="Calibri" w:hAnsi="Calibri"/>
+                <w:b/>
+              </w:rPr>
+            </w:r>
+            <w:r>
+              <w:rPr>
                 <w:b/>
                 <w:i w:val="0"/>
-                <w:color w:val="FFFFFF"/>
                 <w:sz w:val="20"/>
               </w:rPr>
               <w:t>Descrição</w:t>
@@ -944,27 +757,17 @@
         </w:tc>
       </w:tr>
       <w:tr>
-        <w:trPr>
-          <w:cantSplit w:val="1"/>
-        </w:trPr>
         <w:tc>
           <w:tcPr>
-            <w:tcW w:type="dxa" w:w="4451"/>
-            <w:tcMar>
-              <w:top w:w="60" w:type="dxa"/>
-              <w:bottom w:w="60" w:type="dxa"/>
-              <w:left w:w="100" w:type="dxa"/>
-              <w:right w:w="100" w:type="dxa"/>
-            </w:tcMar>
-            <w:shd w:val="clear" w:color="auto" w:fill="EBF5FB"/>
+            <w:tcW w:type="dxa" w:w="4680"/>
           </w:tcPr>
           <w:p>
             <w:pPr>
               <w:spacing w:before="40" w:after="40"/>
             </w:pPr>
+            <w:r/>
             <w:r>
               <w:rPr>
-                <w:rFonts w:ascii="Calibri" w:hAnsi="Calibri"/>
                 <w:b w:val="0"/>
                 <w:i w:val="0"/>
                 <w:sz w:val="20"/>
@@ -975,22 +778,15 @@
         </w:tc>
         <w:tc>
           <w:tcPr>
-            <w:tcW w:type="dxa" w:w="4451"/>
-            <w:tcMar>
-              <w:top w:w="60" w:type="dxa"/>
-              <w:bottom w:w="60" w:type="dxa"/>
-              <w:left w:w="100" w:type="dxa"/>
-              <w:right w:w="100" w:type="dxa"/>
-            </w:tcMar>
-            <w:shd w:val="clear" w:color="auto" w:fill="EBF5FB"/>
+            <w:tcW w:type="dxa" w:w="4680"/>
           </w:tcPr>
           <w:p>
             <w:pPr>
               <w:spacing w:before="40" w:after="40"/>
             </w:pPr>
+            <w:r/>
             <w:r>
               <w:rPr>
-                <w:rFonts w:ascii="Calibri" w:hAnsi="Calibri"/>
                 <w:b w:val="0"/>
                 <w:i w:val="0"/>
                 <w:sz w:val="20"/>
@@ -1001,26 +797,17 @@
         </w:tc>
       </w:tr>
       <w:tr>
-        <w:trPr>
-          <w:cantSplit w:val="1"/>
-        </w:trPr>
         <w:tc>
           <w:tcPr>
-            <w:tcW w:type="dxa" w:w="4451"/>
-            <w:tcMar>
-              <w:top w:w="60" w:type="dxa"/>
-              <w:bottom w:w="60" w:type="dxa"/>
-              <w:left w:w="100" w:type="dxa"/>
-              <w:right w:w="100" w:type="dxa"/>
-            </w:tcMar>
+            <w:tcW w:type="dxa" w:w="4680"/>
           </w:tcPr>
           <w:p>
             <w:pPr>
               <w:spacing w:before="40" w:after="40"/>
             </w:pPr>
+            <w:r/>
             <w:r>
               <w:rPr>
-                <w:rFonts w:ascii="Calibri" w:hAnsi="Calibri"/>
                 <w:b w:val="0"/>
                 <w:i w:val="0"/>
                 <w:sz w:val="20"/>
@@ -1031,21 +818,15 @@
         </w:tc>
         <w:tc>
           <w:tcPr>
-            <w:tcW w:type="dxa" w:w="4451"/>
-            <w:tcMar>
-              <w:top w:w="60" w:type="dxa"/>
-              <w:bottom w:w="60" w:type="dxa"/>
-              <w:left w:w="100" w:type="dxa"/>
-              <w:right w:w="100" w:type="dxa"/>
-            </w:tcMar>
+            <w:tcW w:type="dxa" w:w="4680"/>
           </w:tcPr>
           <w:p>
             <w:pPr>
               <w:spacing w:before="40" w:after="40"/>
             </w:pPr>
+            <w:r/>
             <w:r>
               <w:rPr>
-                <w:rFonts w:ascii="Calibri" w:hAnsi="Calibri"/>
                 <w:b w:val="0"/>
                 <w:i w:val="0"/>
                 <w:sz w:val="20"/>
@@ -1056,27 +837,17 @@
         </w:tc>
       </w:tr>
       <w:tr>
-        <w:trPr>
-          <w:cantSplit w:val="1"/>
-        </w:trPr>
         <w:tc>
           <w:tcPr>
-            <w:tcW w:type="dxa" w:w="4451"/>
-            <w:tcMar>
-              <w:top w:w="60" w:type="dxa"/>
-              <w:bottom w:w="60" w:type="dxa"/>
-              <w:left w:w="100" w:type="dxa"/>
-              <w:right w:w="100" w:type="dxa"/>
-            </w:tcMar>
-            <w:shd w:val="clear" w:color="auto" w:fill="EBF5FB"/>
+            <w:tcW w:type="dxa" w:w="4680"/>
           </w:tcPr>
           <w:p>
             <w:pPr>
               <w:spacing w:before="40" w:after="40"/>
             </w:pPr>
+            <w:r/>
             <w:r>
               <w:rPr>
-                <w:rFonts w:ascii="Calibri" w:hAnsi="Calibri"/>
                 <w:b w:val="0"/>
                 <w:i w:val="0"/>
                 <w:sz w:val="20"/>
@@ -1087,22 +858,15 @@
         </w:tc>
         <w:tc>
           <w:tcPr>
-            <w:tcW w:type="dxa" w:w="4451"/>
-            <w:tcMar>
-              <w:top w:w="60" w:type="dxa"/>
-              <w:bottom w:w="60" w:type="dxa"/>
-              <w:left w:w="100" w:type="dxa"/>
-              <w:right w:w="100" w:type="dxa"/>
-            </w:tcMar>
-            <w:shd w:val="clear" w:color="auto" w:fill="EBF5FB"/>
+            <w:tcW w:type="dxa" w:w="4680"/>
           </w:tcPr>
           <w:p>
             <w:pPr>
               <w:spacing w:before="40" w:after="40"/>
             </w:pPr>
+            <w:r/>
             <w:r>
               <w:rPr>
-                <w:rFonts w:ascii="Calibri" w:hAnsi="Calibri"/>
                 <w:b w:val="0"/>
                 <w:i w:val="0"/>
                 <w:sz w:val="20"/>
@@ -1113,26 +877,17 @@
         </w:tc>
       </w:tr>
       <w:tr>
-        <w:trPr>
-          <w:cantSplit w:val="1"/>
-        </w:trPr>
         <w:tc>
           <w:tcPr>
-            <w:tcW w:type="dxa" w:w="4451"/>
-            <w:tcMar>
-              <w:top w:w="60" w:type="dxa"/>
-              <w:bottom w:w="60" w:type="dxa"/>
-              <w:left w:w="100" w:type="dxa"/>
-              <w:right w:w="100" w:type="dxa"/>
-            </w:tcMar>
+            <w:tcW w:type="dxa" w:w="4680"/>
           </w:tcPr>
           <w:p>
             <w:pPr>
               <w:spacing w:before="40" w:after="40"/>
             </w:pPr>
+            <w:r/>
             <w:r>
               <w:rPr>
-                <w:rFonts w:ascii="Calibri" w:hAnsi="Calibri"/>
                 <w:b w:val="0"/>
                 <w:i w:val="0"/>
                 <w:sz w:val="20"/>
@@ -1143,21 +898,15 @@
         </w:tc>
         <w:tc>
           <w:tcPr>
-            <w:tcW w:type="dxa" w:w="4451"/>
-            <w:tcMar>
-              <w:top w:w="60" w:type="dxa"/>
-              <w:bottom w:w="60" w:type="dxa"/>
-              <w:left w:w="100" w:type="dxa"/>
-              <w:right w:w="100" w:type="dxa"/>
-            </w:tcMar>
+            <w:tcW w:type="dxa" w:w="4680"/>
           </w:tcPr>
           <w:p>
             <w:pPr>
               <w:spacing w:before="40" w:after="40"/>
             </w:pPr>
+            <w:r/>
             <w:r>
               <w:rPr>
-                <w:rFonts w:ascii="Calibri" w:hAnsi="Calibri"/>
                 <w:b w:val="0"/>
                 <w:i w:val="0"/>
                 <w:sz w:val="20"/>
@@ -1168,27 +917,17 @@
         </w:tc>
       </w:tr>
       <w:tr>
-        <w:trPr>
-          <w:cantSplit w:val="1"/>
-        </w:trPr>
         <w:tc>
           <w:tcPr>
-            <w:tcW w:type="dxa" w:w="4451"/>
-            <w:tcMar>
-              <w:top w:w="60" w:type="dxa"/>
-              <w:bottom w:w="60" w:type="dxa"/>
-              <w:left w:w="100" w:type="dxa"/>
-              <w:right w:w="100" w:type="dxa"/>
-            </w:tcMar>
-            <w:shd w:val="clear" w:color="auto" w:fill="EBF5FB"/>
+            <w:tcW w:type="dxa" w:w="4680"/>
           </w:tcPr>
           <w:p>
             <w:pPr>
               <w:spacing w:before="40" w:after="40"/>
             </w:pPr>
+            <w:r/>
             <w:r>
               <w:rPr>
-                <w:rFonts w:ascii="Calibri" w:hAnsi="Calibri"/>
                 <w:b w:val="0"/>
                 <w:i w:val="0"/>
                 <w:sz w:val="20"/>
@@ -1199,22 +938,15 @@
         </w:tc>
         <w:tc>
           <w:tcPr>
-            <w:tcW w:type="dxa" w:w="4451"/>
-            <w:tcMar>
-              <w:top w:w="60" w:type="dxa"/>
-              <w:bottom w:w="60" w:type="dxa"/>
-              <w:left w:w="100" w:type="dxa"/>
-              <w:right w:w="100" w:type="dxa"/>
-            </w:tcMar>
-            <w:shd w:val="clear" w:color="auto" w:fill="EBF5FB"/>
+            <w:tcW w:type="dxa" w:w="4680"/>
           </w:tcPr>
           <w:p>
             <w:pPr>
               <w:spacing w:before="40" w:after="40"/>
             </w:pPr>
+            <w:r/>
             <w:r>
               <w:rPr>
-                <w:rFonts w:ascii="Calibri" w:hAnsi="Calibri"/>
                 <w:b w:val="0"/>
                 <w:i w:val="0"/>
                 <w:sz w:val="20"/>
@@ -1225,145 +957,134 @@
         </w:tc>
       </w:tr>
     </w:tbl>
+    <w:p/>
     <w:p>
       <w:pPr>
-        <w:spacing w:before="0" w:after="160"/>
-      </w:pPr>
-    </w:p>
-    <w:p>
-      <w:pPr>
-        <w:spacing w:before="0" w:after="120"/>
+        <w:spacing w:after="80"/>
       </w:pPr>
       <w:r>
         <w:rPr>
-          <w:rFonts w:ascii="Calibri" w:hAnsi="Calibri"/>
           <w:b/>
           <w:i w:val="0"/>
-          <w:sz w:val="22"/>
+          <w:sz w:val="20"/>
         </w:rPr>
         <w:t>Cadência de atualização:</w:t>
       </w:r>
       <w:r>
         <w:rPr>
-          <w:rFonts w:ascii="Calibri" w:hAnsi="Calibri"/>
           <w:b w:val="0"/>
           <w:i w:val="0"/>
-          <w:sz w:val="22"/>
+          <w:sz w:val="20"/>
         </w:rPr>
         <w:t xml:space="preserve"> o quadro é revisado antes do início de cada sprint e sempre que ocorre mudança de alocação.</w:t>
       </w:r>
     </w:p>
     <w:p>
       <w:pPr>
-        <w:spacing w:before="0" w:after="120"/>
+        <w:spacing w:after="80"/>
       </w:pPr>
       <w:r>
         <w:rPr>
-          <w:rFonts w:ascii="Calibri" w:hAnsi="Calibri"/>
           <w:b/>
           <w:i w:val="0"/>
-          <w:sz w:val="22"/>
+          <w:sz w:val="20"/>
         </w:rPr>
         <w:t>Responsável pela manutenção:</w:t>
       </w:r>
       <w:r>
         <w:rPr>
-          <w:rFonts w:ascii="Calibri" w:hAnsi="Calibri"/>
           <w:b w:val="0"/>
           <w:i w:val="0"/>
-          <w:sz w:val="22"/>
+          <w:sz w:val="20"/>
         </w:rPr>
         <w:t xml:space="preserve"> COO (Operações), com apoio dos Gerentes de Projeto.</w:t>
       </w:r>
     </w:p>
     <w:p>
       <w:pPr>
-        <w:spacing w:before="0" w:after="120"/>
+        <w:spacing w:after="80"/>
       </w:pPr>
       <w:r>
         <w:rPr>
-          <w:rFonts w:ascii="Calibri" w:hAnsi="Calibri"/>
           <w:b/>
           <w:i w:val="0"/>
-          <w:sz w:val="22"/>
+          <w:sz w:val="20"/>
         </w:rPr>
         <w:t>Critério de escalada:</w:t>
       </w:r>
       <w:r>
         <w:rPr>
-          <w:rFonts w:ascii="Calibri" w:hAnsi="Calibri"/>
           <w:b w:val="0"/>
           <w:i w:val="0"/>
-          <w:sz w:val="22"/>
+          <w:sz w:val="20"/>
         </w:rPr>
         <w:t xml:space="preserve"> quando um recurso compartilhado ultrapassa 100% de alocação por duas sprints consecutivas, o COO convoca reunião de repriorização com os GPs envolvidos para ajustar escopo ou prazos.</w:t>
       </w:r>
     </w:p>
     <w:p>
       <w:pPr>
-        <w:pStyle w:val="Heading2"/>
-        <w:keepNext/>
-        <w:keepLines/>
+        <w:pStyle w:val="Heading3"/>
       </w:pPr>
       <w:r>
+        <w:rPr>
+          <w:b/>
+          <w:color w:val="1F497D"/>
+          <w:sz w:val="22"/>
+        </w:rPr>
         <w:t>4.2. Autoridade</w:t>
       </w:r>
     </w:p>
     <w:p>
       <w:pPr>
-        <w:spacing w:before="0" w:after="120"/>
+        <w:spacing w:after="80"/>
       </w:pPr>
       <w:r>
         <w:rPr>
-          <w:rFonts w:ascii="Calibri" w:hAnsi="Calibri"/>
           <w:b w:val="0"/>
           <w:i w:val="0"/>
-          <w:sz w:val="22"/>
+          <w:sz w:val="20"/>
         </w:rPr>
         <w:t xml:space="preserve">A autoridade para decidir sobre a priorização do portfólio e a alocação de recursos compartilhados é do </w:t>
       </w:r>
       <w:r>
         <w:rPr>
-          <w:rFonts w:ascii="Calibri" w:hAnsi="Calibri"/>
           <w:b/>
           <w:i w:val="0"/>
-          <w:sz w:val="22"/>
+          <w:sz w:val="20"/>
         </w:rPr>
         <w:t>COO (Operações)</w:t>
       </w:r>
       <w:r>
         <w:rPr>
-          <w:rFonts w:ascii="Calibri" w:hAnsi="Calibri"/>
           <w:b w:val="0"/>
           <w:i w:val="0"/>
-          <w:sz w:val="22"/>
+          <w:sz w:val="20"/>
         </w:rPr>
         <w:t>, responsável pelo escritório de portfólio de projetos, apoiado pelas informações de capacity e pela situação dos projetos. Decisões de natureza estratégica são reportadas ao CEO.</w:t>
       </w:r>
     </w:p>
     <w:p>
       <w:pPr>
-        <w:pStyle w:val="Heading1"/>
-        <w:keepNext/>
-        <w:keepLines/>
-        <w:pBdr>
-          <w:bottom w:val="single" w:sz="4" w:space="2" w:color="D6E4F0"/>
-        </w:pBdr>
+        <w:pStyle w:val="Heading2"/>
       </w:pPr>
       <w:r>
+        <w:rPr>
+          <w:b/>
+          <w:color w:val="2E74B5"/>
+          <w:sz w:val="26"/>
+        </w:rPr>
         <w:t>5. Acompanhamento do portfólio</w:t>
       </w:r>
     </w:p>
     <w:p>
       <w:pPr>
-        <w:spacing w:before="0" w:after="120"/>
+        <w:spacing w:after="80"/>
       </w:pPr>
       <w:r>
         <w:rPr>
-          <w:rFonts w:ascii="Calibri" w:hAnsi="Calibri"/>
           <w:b w:val="0"/>
           <w:i w:val="0"/>
-          <w:sz w:val="22"/>
+          <w:sz w:val="20"/>
         </w:rPr>
         <w:t>Os projetos do portfólio são acompanhados de forma consolidada quanto ao cumprimento dos compromissos (prazo, escopo, recursos). O acompanhamento:</w:t>
       </w:r>
@@ -1371,14 +1092,13 @@
     <w:p>
       <w:pPr>
         <w:pStyle w:val="ListBullet"/>
-        <w:spacing w:before="20" w:after="40"/>
+        <w:spacing w:before="0" w:after="0"/>
       </w:pPr>
       <w:r>
         <w:rPr>
-          <w:rFonts w:ascii="Calibri" w:hAnsi="Calibri"/>
           <w:b w:val="0"/>
           <w:i w:val="0"/>
-          <w:sz w:val="22"/>
+          <w:sz w:val="20"/>
         </w:rPr>
         <w:t>consolida a situação dos projetos em andamento;</w:t>
       </w:r>
@@ -1386,14 +1106,13 @@
     <w:p>
       <w:pPr>
         <w:pStyle w:val="ListBullet"/>
-        <w:spacing w:before="20" w:after="40"/>
+        <w:spacing w:before="0" w:after="0"/>
       </w:pPr>
       <w:r>
         <w:rPr>
-          <w:rFonts w:ascii="Calibri" w:hAnsi="Calibri"/>
           <w:b w:val="0"/>
           <w:i w:val="0"/>
-          <w:sz w:val="22"/>
+          <w:sz w:val="20"/>
         </w:rPr>
         <w:t>identifica projetos que se desviam dos acordos assumidos;</w:t>
       </w:r>
@@ -1401,76 +1120,74 @@
     <w:p>
       <w:pPr>
         <w:pStyle w:val="ListBullet"/>
-        <w:spacing w:before="20" w:after="40"/>
+        <w:spacing w:before="0" w:after="0"/>
       </w:pPr>
       <w:r>
         <w:rPr>
-          <w:rFonts w:ascii="Calibri" w:hAnsi="Calibri"/>
           <w:b w:val="0"/>
           <w:i w:val="0"/>
-          <w:sz w:val="22"/>
+          <w:sz w:val="20"/>
         </w:rPr>
         <w:t>direciona o tratamento dos desvios — realocação de recursos, repriorização ou ações específicas no projeto.</w:t>
       </w:r>
     </w:p>
     <w:p>
       <w:pPr>
-        <w:spacing w:before="0" w:after="120"/>
+        <w:spacing w:after="80"/>
       </w:pPr>
       <w:r>
         <w:rPr>
-          <w:rFonts w:ascii="Calibri" w:hAnsi="Calibri"/>
           <w:b w:val="0"/>
           <w:i w:val="0"/>
-          <w:sz w:val="22"/>
+          <w:sz w:val="20"/>
         </w:rPr>
-        <w:t>O acompanhamento do portfólio é apoiado pelas informações do Jira (situação dos projetos) e pelo quadro de capacity, e é tratado nas análises críticas pela direção (PRO-OSW-001).</w:t>
+        <w:t xml:space="preserve">O acompanhamento do portfólio é apoiado pelas informações do Jira (situação dos projetos) e pelo quadro de capacity, e é tratado nas análises críticas pela direção (PRO-OSW-001). A consolidação periódica dessa operação, para fins de governança e auditoria, é registrada no </w:t>
+      </w:r>
+      <w:r>
+        <w:rPr>
+          <w:b/>
+          <w:i w:val="0"/>
+          <w:sz w:val="20"/>
+        </w:rPr>
+        <w:t>Painel de Portfólio (REG-OSW-001)</w:t>
+      </w:r>
+      <w:r>
+        <w:rPr>
+          <w:b w:val="0"/>
+          <w:i w:val="0"/>
+          <w:sz w:val="20"/>
+        </w:rPr>
+        <w:t>.</w:t>
       </w:r>
     </w:p>
     <w:p>
       <w:pPr>
-        <w:pStyle w:val="Heading1"/>
-        <w:keepNext/>
-        <w:keepLines/>
-        <w:pBdr>
-          <w:bottom w:val="single" w:sz="4" w:space="2" w:color="D6E4F0"/>
-        </w:pBdr>
+        <w:pStyle w:val="Heading2"/>
       </w:pPr>
       <w:r>
+        <w:rPr>
+          <w:b/>
+          <w:color w:val="2E74B5"/>
+          <w:sz w:val="26"/>
+        </w:rPr>
         <w:t>6. Papéis</w:t>
       </w:r>
     </w:p>
     <w:tbl>
       <w:tblPr>
+        <w:tblStyle w:val="TableGrid"/>
         <w:tblW w:type="auto" w:w="0"/>
         <w:tblLook w:firstColumn="1" w:firstRow="1" w:lastColumn="0" w:lastRow="0" w:noHBand="0" w:noVBand="1" w:val="04A0"/>
-        <w:tblBorders>
-          <w:top w:val="single" w:sz="4" w:space="0" w:color="003366"/>
-          <w:left w:val="single" w:sz="4" w:space="0" w:color="003366"/>
-          <w:bottom w:val="single" w:sz="4" w:space="0" w:color="003366"/>
-          <w:right w:val="single" w:sz="4" w:space="0" w:color="003366"/>
-          <w:insideH w:val="single" w:sz="4" w:space="0" w:color="003366"/>
-          <w:insideV w:val="single" w:sz="4" w:space="0" w:color="003366"/>
-        </w:tblBorders>
       </w:tblPr>
       <w:tblGrid>
-        <w:gridCol w:w="4451"/>
-        <w:gridCol w:w="4451"/>
+        <w:gridCol w:w="4680"/>
+        <w:gridCol w:w="4680"/>
       </w:tblGrid>
       <w:tr>
-        <w:trPr>
-          <w:cantSplit w:val="1"/>
-        </w:trPr>
         <w:tc>
           <w:tcPr>
-            <w:tcW w:type="dxa" w:w="4451"/>
-            <w:tcMar>
-              <w:top w:w="60" w:type="dxa"/>
-              <w:bottom w:w="60" w:type="dxa"/>
-              <w:left w:w="100" w:type="dxa"/>
-              <w:right w:w="100" w:type="dxa"/>
-            </w:tcMar>
-            <w:shd w:val="clear" w:color="auto" w:fill="003366"/>
+            <w:tcW w:type="dxa" w:w="4680"/>
+            <w:shd w:val="clear" w:color="auto" w:fill="D6E4F7"/>
           </w:tcPr>
           <w:p>
             <w:pPr>
@@ -1478,10 +1195,13 @@
             </w:pPr>
             <w:r>
               <w:rPr>
-                <w:rFonts w:ascii="Calibri" w:hAnsi="Calibri"/>
+                <w:b/>
+              </w:rPr>
+            </w:r>
+            <w:r>
+              <w:rPr>
                 <w:b/>
                 <w:i w:val="0"/>
-                <w:color w:val="FFFFFF"/>
                 <w:sz w:val="20"/>
               </w:rPr>
               <w:t>Papel</w:t>
@@ -1490,14 +1210,8 @@
         </w:tc>
         <w:tc>
           <w:tcPr>
-            <w:tcW w:type="dxa" w:w="4451"/>
-            <w:tcMar>
-              <w:top w:w="60" w:type="dxa"/>
-              <w:bottom w:w="60" w:type="dxa"/>
-              <w:left w:w="100" w:type="dxa"/>
-              <w:right w:w="100" w:type="dxa"/>
-            </w:tcMar>
-            <w:shd w:val="clear" w:color="auto" w:fill="003366"/>
+            <w:tcW w:type="dxa" w:w="4680"/>
+            <w:shd w:val="clear" w:color="auto" w:fill="D6E4F7"/>
           </w:tcPr>
           <w:p>
             <w:pPr>
@@ -1505,10 +1219,13 @@
             </w:pPr>
             <w:r>
               <w:rPr>
-                <w:rFonts w:ascii="Calibri" w:hAnsi="Calibri"/>
+                <w:b/>
+              </w:rPr>
+            </w:r>
+            <w:r>
+              <w:rPr>
                 <w:b/>
                 <w:i w:val="0"/>
-                <w:color w:val="FFFFFF"/>
                 <w:sz w:val="20"/>
               </w:rPr>
               <w:t>Responsabilidade</w:t>
@@ -1517,27 +1234,17 @@
         </w:tc>
       </w:tr>
       <w:tr>
-        <w:trPr>
-          <w:cantSplit w:val="1"/>
-        </w:trPr>
         <w:tc>
           <w:tcPr>
-            <w:tcW w:type="dxa" w:w="4451"/>
-            <w:tcMar>
-              <w:top w:w="60" w:type="dxa"/>
-              <w:bottom w:w="60" w:type="dxa"/>
-              <w:left w:w="100" w:type="dxa"/>
-              <w:right w:w="100" w:type="dxa"/>
-            </w:tcMar>
-            <w:shd w:val="clear" w:color="auto" w:fill="EBF5FB"/>
+            <w:tcW w:type="dxa" w:w="4680"/>
           </w:tcPr>
           <w:p>
             <w:pPr>
               <w:spacing w:before="40" w:after="40"/>
             </w:pPr>
+            <w:r/>
             <w:r>
               <w:rPr>
-                <w:rFonts w:ascii="Calibri" w:hAnsi="Calibri"/>
                 <w:b/>
                 <w:i w:val="0"/>
                 <w:sz w:val="20"/>
@@ -1548,22 +1255,15 @@
         </w:tc>
         <w:tc>
           <w:tcPr>
-            <w:tcW w:type="dxa" w:w="4451"/>
-            <w:tcMar>
-              <w:top w:w="60" w:type="dxa"/>
-              <w:bottom w:w="60" w:type="dxa"/>
-              <w:left w:w="100" w:type="dxa"/>
-              <w:right w:w="100" w:type="dxa"/>
-            </w:tcMar>
-            <w:shd w:val="clear" w:color="auto" w:fill="EBF5FB"/>
+            <w:tcW w:type="dxa" w:w="4680"/>
           </w:tcPr>
           <w:p>
             <w:pPr>
               <w:spacing w:before="40" w:after="40"/>
             </w:pPr>
+            <w:r/>
             <w:r>
               <w:rPr>
-                <w:rFonts w:ascii="Calibri" w:hAnsi="Calibri"/>
                 <w:b w:val="0"/>
                 <w:i w:val="0"/>
                 <w:sz w:val="20"/>
@@ -1574,26 +1274,17 @@
         </w:tc>
       </w:tr>
       <w:tr>
-        <w:trPr>
-          <w:cantSplit w:val="1"/>
-        </w:trPr>
         <w:tc>
           <w:tcPr>
-            <w:tcW w:type="dxa" w:w="4451"/>
-            <w:tcMar>
-              <w:top w:w="60" w:type="dxa"/>
-              <w:bottom w:w="60" w:type="dxa"/>
-              <w:left w:w="100" w:type="dxa"/>
-              <w:right w:w="100" w:type="dxa"/>
-            </w:tcMar>
+            <w:tcW w:type="dxa" w:w="4680"/>
           </w:tcPr>
           <w:p>
             <w:pPr>
               <w:spacing w:before="40" w:after="40"/>
             </w:pPr>
+            <w:r/>
             <w:r>
               <w:rPr>
-                <w:rFonts w:ascii="Calibri" w:hAnsi="Calibri"/>
                 <w:b/>
                 <w:i w:val="0"/>
                 <w:sz w:val="20"/>
@@ -1604,21 +1295,15 @@
         </w:tc>
         <w:tc>
           <w:tcPr>
-            <w:tcW w:type="dxa" w:w="4451"/>
-            <w:tcMar>
-              <w:top w:w="60" w:type="dxa"/>
-              <w:bottom w:w="60" w:type="dxa"/>
-              <w:left w:w="100" w:type="dxa"/>
-              <w:right w:w="100" w:type="dxa"/>
-            </w:tcMar>
+            <w:tcW w:type="dxa" w:w="4680"/>
           </w:tcPr>
           <w:p>
             <w:pPr>
               <w:spacing w:before="40" w:after="40"/>
             </w:pPr>
+            <w:r/>
             <w:r>
               <w:rPr>
-                <w:rFonts w:ascii="Calibri" w:hAnsi="Calibri"/>
                 <w:b w:val="0"/>
                 <w:i w:val="0"/>
                 <w:sz w:val="20"/>
@@ -1629,27 +1314,17 @@
         </w:tc>
       </w:tr>
       <w:tr>
-        <w:trPr>
-          <w:cantSplit w:val="1"/>
-        </w:trPr>
         <w:tc>
           <w:tcPr>
-            <w:tcW w:type="dxa" w:w="4451"/>
-            <w:tcMar>
-              <w:top w:w="60" w:type="dxa"/>
-              <w:bottom w:w="60" w:type="dxa"/>
-              <w:left w:w="100" w:type="dxa"/>
-              <w:right w:w="100" w:type="dxa"/>
-            </w:tcMar>
-            <w:shd w:val="clear" w:color="auto" w:fill="EBF5FB"/>
+            <w:tcW w:type="dxa" w:w="4680"/>
           </w:tcPr>
           <w:p>
             <w:pPr>
               <w:spacing w:before="40" w:after="40"/>
             </w:pPr>
+            <w:r/>
             <w:r>
               <w:rPr>
-                <w:rFonts w:ascii="Calibri" w:hAnsi="Calibri"/>
                 <w:b/>
                 <w:i w:val="0"/>
                 <w:sz w:val="20"/>
@@ -1660,22 +1335,15 @@
         </w:tc>
         <w:tc>
           <w:tcPr>
-            <w:tcW w:type="dxa" w:w="4451"/>
-            <w:tcMar>
-              <w:top w:w="60" w:type="dxa"/>
-              <w:bottom w:w="60" w:type="dxa"/>
-              <w:left w:w="100" w:type="dxa"/>
-              <w:right w:w="100" w:type="dxa"/>
-            </w:tcMar>
-            <w:shd w:val="clear" w:color="auto" w:fill="EBF5FB"/>
+            <w:tcW w:type="dxa" w:w="4680"/>
           </w:tcPr>
           <w:p>
             <w:pPr>
               <w:spacing w:before="40" w:after="40"/>
             </w:pPr>
+            <w:r/>
             <w:r>
               <w:rPr>
-                <w:rFonts w:ascii="Calibri" w:hAnsi="Calibri"/>
                 <w:b w:val="0"/>
                 <w:i w:val="0"/>
                 <w:sz w:val="20"/>
@@ -1686,35 +1354,30 @@
         </w:tc>
       </w:tr>
     </w:tbl>
+    <w:p/>
     <w:p>
       <w:pPr>
-        <w:spacing w:before="0" w:after="160"/>
-      </w:pPr>
-    </w:p>
-    <w:p>
-      <w:pPr>
-        <w:pStyle w:val="Heading1"/>
-        <w:keepNext/>
-        <w:keepLines/>
-        <w:pBdr>
-          <w:bottom w:val="single" w:sz="4" w:space="2" w:color="D6E4F0"/>
-        </w:pBdr>
+        <w:pStyle w:val="Heading2"/>
       </w:pPr>
       <w:r>
+        <w:rPr>
+          <w:b/>
+          <w:color w:val="2E74B5"/>
+          <w:sz w:val="26"/>
+        </w:rPr>
         <w:t>7. Documentos relacionados</w:t>
       </w:r>
     </w:p>
     <w:p>
       <w:pPr>
         <w:pStyle w:val="ListBullet"/>
-        <w:spacing w:before="20" w:after="40"/>
+        <w:spacing w:before="0" w:after="0"/>
       </w:pPr>
       <w:r>
         <w:rPr>
-          <w:rFonts w:ascii="Calibri" w:hAnsi="Calibri"/>
           <w:b w:val="0"/>
           <w:i w:val="0"/>
-          <w:sz w:val="22"/>
+          <w:sz w:val="20"/>
         </w:rPr>
         <w:t>POL-ORG-001 — Política Organizacional de Processos</w:t>
       </w:r>
@@ -1722,14 +1385,13 @@
     <w:p>
       <w:pPr>
         <w:pStyle w:val="ListBullet"/>
-        <w:spacing w:before="20" w:after="40"/>
+        <w:spacing w:before="0" w:after="0"/>
       </w:pPr>
       <w:r>
         <w:rPr>
-          <w:rFonts w:ascii="Calibri" w:hAnsi="Calibri"/>
           <w:b w:val="0"/>
           <w:i w:val="0"/>
-          <w:sz w:val="22"/>
+          <w:sz w:val="20"/>
         </w:rPr>
         <w:t>PRO-OSW-001 — Governança Organizacional de Processos</w:t>
       </w:r>
@@ -1737,14 +1399,13 @@
     <w:p>
       <w:pPr>
         <w:pStyle w:val="ListBullet"/>
-        <w:spacing w:before="20" w:after="40"/>
+        <w:spacing w:before="0" w:after="0"/>
       </w:pPr>
       <w:r>
         <w:rPr>
-          <w:rFonts w:ascii="Calibri" w:hAnsi="Calibri"/>
           <w:b w:val="0"/>
           <w:i w:val="0"/>
-          <w:sz w:val="22"/>
+          <w:sz w:val="20"/>
         </w:rPr>
         <w:t>EST-GPC-002 — Estratégia de Gerência de Riscos e Oportunidades</w:t>
       </w:r>
@@ -1752,126 +1413,117 @@
     <w:p>
       <w:pPr>
         <w:pStyle w:val="ListBullet"/>
-        <w:spacing w:before="20" w:after="40"/>
+        <w:spacing w:before="0" w:after="0"/>
       </w:pPr>
       <w:r>
         <w:rPr>
-          <w:rFonts w:ascii="Calibri" w:hAnsi="Calibri"/>
           <w:b w:val="0"/>
           <w:i w:val="0"/>
-          <w:sz w:val="22"/>
+          <w:sz w:val="20"/>
+        </w:rPr>
+        <w:t>REG-OSW-001 — Painel de Portfólio de Projetos (registro consolidado)</w:t>
+      </w:r>
+    </w:p>
+    <w:p>
+      <w:pPr>
+        <w:pStyle w:val="ListBullet"/>
+        <w:spacing w:before="0" w:after="0"/>
+      </w:pPr>
+      <w:r>
+        <w:rPr>
+          <w:b w:val="0"/>
+          <w:i w:val="0"/>
+          <w:sz w:val="20"/>
         </w:rPr>
         <w:t>Processo de Gerência de Projetos (GPR)</w:t>
       </w:r>
     </w:p>
     <w:p>
       <w:pPr>
-        <w:pStyle w:val="Heading1"/>
-        <w:keepNext/>
-        <w:keepLines/>
-        <w:pBdr>
-          <w:bottom w:val="single" w:sz="4" w:space="2" w:color="D6E4F0"/>
-        </w:pBdr>
+        <w:pStyle w:val="Heading2"/>
       </w:pPr>
       <w:r>
+        <w:rPr>
+          <w:b/>
+          <w:color w:val="2E74B5"/>
+          <w:sz w:val="26"/>
+        </w:rPr>
         <w:t>8. Rastreabilidade e instrução para auditoria</w:t>
       </w:r>
     </w:p>
     <w:p>
       <w:pPr>
-        <w:spacing w:before="0" w:after="120"/>
+        <w:spacing w:after="80"/>
       </w:pPr>
       <w:r>
         <w:rPr>
-          <w:rFonts w:ascii="Calibri" w:hAnsi="Calibri"/>
           <w:b w:val="0"/>
           <w:i/>
-          <w:sz w:val="22"/>
+          <w:sz w:val="20"/>
         </w:rPr>
         <w:t>Esta seção é destinada à equipe de avaliação e relaciona o conteúdo deste documento aos resultados esperados do modelo de referência MR-MPS-SW. No corpo, o conteúdo é descrito na linguagem operacional da Timeware; o quadro abaixo indica onde cada resultado é atendido.</w:t>
       </w:r>
     </w:p>
     <w:p>
       <w:pPr>
-        <w:spacing w:before="0" w:after="120"/>
+        <w:spacing w:after="80"/>
       </w:pPr>
       <w:r>
         <w:rPr>
-          <w:rFonts w:ascii="Calibri" w:hAnsi="Calibri"/>
           <w:b w:val="0"/>
           <w:i w:val="0"/>
-          <w:sz w:val="22"/>
+          <w:sz w:val="20"/>
         </w:rPr>
         <w:t xml:space="preserve">Este documento corresponde aos resultados </w:t>
       </w:r>
       <w:r>
         <w:rPr>
-          <w:rFonts w:ascii="Calibri" w:hAnsi="Calibri"/>
           <w:b/>
           <w:i w:val="0"/>
-          <w:sz w:val="22"/>
+          <w:sz w:val="20"/>
         </w:rPr>
         <w:t>OSW 8, 9, 10</w:t>
       </w:r>
       <w:r>
         <w:rPr>
-          <w:rFonts w:ascii="Calibri" w:hAnsi="Calibri"/>
           <w:b w:val="0"/>
           <w:i w:val="0"/>
-          <w:sz w:val="22"/>
+          <w:sz w:val="20"/>
         </w:rPr>
         <w:t xml:space="preserve"> do processo </w:t>
       </w:r>
       <w:r>
         <w:rPr>
-          <w:rFonts w:ascii="Calibri" w:hAnsi="Calibri"/>
           <w:b/>
           <w:i w:val="0"/>
-          <w:sz w:val="22"/>
+          <w:sz w:val="20"/>
         </w:rPr>
         <w:t>Gerência Organizacional de Software (OSW)</w:t>
       </w:r>
       <w:r>
         <w:rPr>
-          <w:rFonts w:ascii="Calibri" w:hAnsi="Calibri"/>
           <w:b w:val="0"/>
           <w:i w:val="0"/>
-          <w:sz w:val="22"/>
+          <w:sz w:val="20"/>
         </w:rPr>
         <w:t xml:space="preserve"> do MR-MPS-SW:2024.</w:t>
       </w:r>
     </w:p>
     <w:tbl>
       <w:tblPr>
+        <w:tblStyle w:val="TableGrid"/>
         <w:tblW w:type="auto" w:w="0"/>
         <w:tblLook w:firstColumn="1" w:firstRow="1" w:lastColumn="0" w:lastRow="0" w:noHBand="0" w:noVBand="1" w:val="04A0"/>
-        <w:tblBorders>
-          <w:top w:val="single" w:sz="4" w:space="0" w:color="003366"/>
-          <w:left w:val="single" w:sz="4" w:space="0" w:color="003366"/>
-          <w:bottom w:val="single" w:sz="4" w:space="0" w:color="003366"/>
-          <w:right w:val="single" w:sz="4" w:space="0" w:color="003366"/>
-          <w:insideH w:val="single" w:sz="4" w:space="0" w:color="003366"/>
-          <w:insideV w:val="single" w:sz="4" w:space="0" w:color="003366"/>
-        </w:tblBorders>
       </w:tblPr>
       <w:tblGrid>
-        <w:gridCol w:w="4451"/>
-        <w:gridCol w:w="4451"/>
+        <w:gridCol w:w="4680"/>
+        <w:gridCol w:w="4680"/>
       </w:tblGrid>
       <w:tr>
-        <w:trPr>
-          <w:cantSplit w:val="1"/>
-        </w:trPr>
         <w:tc>
           <w:tcPr>
-            <w:tcW w:type="dxa" w:w="4451"/>
-            <w:tcMar>
-              <w:top w:w="60" w:type="dxa"/>
-              <w:bottom w:w="60" w:type="dxa"/>
-              <w:left w:w="100" w:type="dxa"/>
-              <w:right w:w="100" w:type="dxa"/>
-            </w:tcMar>
-            <w:shd w:val="clear" w:color="auto" w:fill="003366"/>
+            <w:tcW w:type="dxa" w:w="4680"/>
+            <w:shd w:val="clear" w:color="auto" w:fill="D6E4F7"/>
           </w:tcPr>
           <w:p>
             <w:pPr>
@@ -1879,10 +1531,13 @@
             </w:pPr>
             <w:r>
               <w:rPr>
-                <w:rFonts w:ascii="Calibri" w:hAnsi="Calibri"/>
+                <w:b/>
+              </w:rPr>
+            </w:r>
+            <w:r>
+              <w:rPr>
                 <w:b/>
                 <w:i w:val="0"/>
-                <w:color w:val="FFFFFF"/>
                 <w:sz w:val="20"/>
               </w:rPr>
               <w:t>Resultado</w:t>
@@ -1891,14 +1546,8 @@
         </w:tc>
         <w:tc>
           <w:tcPr>
-            <w:tcW w:type="dxa" w:w="4451"/>
-            <w:tcMar>
-              <w:top w:w="60" w:type="dxa"/>
-              <w:bottom w:w="60" w:type="dxa"/>
-              <w:left w:w="100" w:type="dxa"/>
-              <w:right w:w="100" w:type="dxa"/>
-            </w:tcMar>
-            <w:shd w:val="clear" w:color="auto" w:fill="003366"/>
+            <w:tcW w:type="dxa" w:w="4680"/>
+            <w:shd w:val="clear" w:color="auto" w:fill="D6E4F7"/>
           </w:tcPr>
           <w:p>
             <w:pPr>
@@ -1906,10 +1555,13 @@
             </w:pPr>
             <w:r>
               <w:rPr>
-                <w:rFonts w:ascii="Calibri" w:hAnsi="Calibri"/>
+                <w:b/>
+              </w:rPr>
+            </w:r>
+            <w:r>
+              <w:rPr>
                 <w:b/>
                 <w:i w:val="0"/>
-                <w:color w:val="FFFFFF"/>
                 <w:sz w:val="20"/>
               </w:rPr>
               <w:t>Onde é atendido neste documento</w:t>
@@ -1918,27 +1570,17 @@
         </w:tc>
       </w:tr>
       <w:tr>
-        <w:trPr>
-          <w:cantSplit w:val="1"/>
-        </w:trPr>
         <w:tc>
           <w:tcPr>
-            <w:tcW w:type="dxa" w:w="4451"/>
-            <w:tcMar>
-              <w:top w:w="60" w:type="dxa"/>
-              <w:bottom w:w="60" w:type="dxa"/>
-              <w:left w:w="100" w:type="dxa"/>
-              <w:right w:w="100" w:type="dxa"/>
-            </w:tcMar>
-            <w:shd w:val="clear" w:color="auto" w:fill="EBF5FB"/>
+            <w:tcW w:type="dxa" w:w="4680"/>
           </w:tcPr>
           <w:p>
             <w:pPr>
               <w:spacing w:before="40" w:after="40"/>
             </w:pPr>
+            <w:r/>
             <w:r>
               <w:rPr>
-                <w:rFonts w:ascii="Calibri" w:hAnsi="Calibri"/>
                 <w:b w:val="0"/>
                 <w:i w:val="0"/>
                 <w:sz w:val="20"/>
@@ -1949,52 +1591,36 @@
         </w:tc>
         <w:tc>
           <w:tcPr>
-            <w:tcW w:type="dxa" w:w="4451"/>
-            <w:tcMar>
-              <w:top w:w="60" w:type="dxa"/>
-              <w:bottom w:w="60" w:type="dxa"/>
-              <w:left w:w="100" w:type="dxa"/>
-              <w:right w:w="100" w:type="dxa"/>
-            </w:tcMar>
-            <w:shd w:val="clear" w:color="auto" w:fill="EBF5FB"/>
+            <w:tcW w:type="dxa" w:w="4680"/>
           </w:tcPr>
           <w:p>
             <w:pPr>
               <w:spacing w:before="40" w:after="40"/>
             </w:pPr>
+            <w:r/>
             <w:r>
               <w:rPr>
-                <w:rFonts w:ascii="Calibri" w:hAnsi="Calibri"/>
                 <w:b w:val="0"/>
                 <w:i w:val="0"/>
                 <w:sz w:val="20"/>
               </w:rPr>
-              <w:t>Seção 3</w:t>
+              <w:t>Seção 3; evidência consolidada em REG-OSW-001 §3–4</w:t>
             </w:r>
           </w:p>
         </w:tc>
       </w:tr>
       <w:tr>
-        <w:trPr>
-          <w:cantSplit w:val="1"/>
-        </w:trPr>
         <w:tc>
           <w:tcPr>
-            <w:tcW w:type="dxa" w:w="4451"/>
-            <w:tcMar>
-              <w:top w:w="60" w:type="dxa"/>
-              <w:bottom w:w="60" w:type="dxa"/>
-              <w:left w:w="100" w:type="dxa"/>
-              <w:right w:w="100" w:type="dxa"/>
-            </w:tcMar>
+            <w:tcW w:type="dxa" w:w="4680"/>
           </w:tcPr>
           <w:p>
             <w:pPr>
               <w:spacing w:before="40" w:after="40"/>
             </w:pPr>
+            <w:r/>
             <w:r>
               <w:rPr>
-                <w:rFonts w:ascii="Calibri" w:hAnsi="Calibri"/>
                 <w:b w:val="0"/>
                 <w:i w:val="0"/>
                 <w:sz w:val="20"/>
@@ -2005,52 +1631,36 @@
         </w:tc>
         <w:tc>
           <w:tcPr>
-            <w:tcW w:type="dxa" w:w="4451"/>
-            <w:tcMar>
-              <w:top w:w="60" w:type="dxa"/>
-              <w:bottom w:w="60" w:type="dxa"/>
-              <w:left w:w="100" w:type="dxa"/>
-              <w:right w:w="100" w:type="dxa"/>
-            </w:tcMar>
+            <w:tcW w:type="dxa" w:w="4680"/>
           </w:tcPr>
           <w:p>
             <w:pPr>
               <w:spacing w:before="40" w:after="40"/>
             </w:pPr>
+            <w:r/>
             <w:r>
               <w:rPr>
-                <w:rFonts w:ascii="Calibri" w:hAnsi="Calibri"/>
                 <w:b w:val="0"/>
                 <w:i w:val="0"/>
                 <w:sz w:val="20"/>
               </w:rPr>
-              <w:t>Seção 4</w:t>
+              <w:t>Seção 4; evidência consolidada em REG-OSW-001 §5</w:t>
             </w:r>
           </w:p>
         </w:tc>
       </w:tr>
       <w:tr>
-        <w:trPr>
-          <w:cantSplit w:val="1"/>
-        </w:trPr>
         <w:tc>
           <w:tcPr>
-            <w:tcW w:type="dxa" w:w="4451"/>
-            <w:tcMar>
-              <w:top w:w="60" w:type="dxa"/>
-              <w:bottom w:w="60" w:type="dxa"/>
-              <w:left w:w="100" w:type="dxa"/>
-              <w:right w:w="100" w:type="dxa"/>
-            </w:tcMar>
-            <w:shd w:val="clear" w:color="auto" w:fill="EBF5FB"/>
+            <w:tcW w:type="dxa" w:w="4680"/>
           </w:tcPr>
           <w:p>
             <w:pPr>
               <w:spacing w:before="40" w:after="40"/>
             </w:pPr>
+            <w:r/>
             <w:r>
               <w:rPr>
-                <w:rFonts w:ascii="Calibri" w:hAnsi="Calibri"/>
                 <w:b w:val="0"/>
                 <w:i w:val="0"/>
                 <w:sz w:val="20"/>
@@ -2061,14 +1671,63 @@
         </w:tc>
         <w:tc>
           <w:tcPr>
-            <w:tcW w:type="dxa" w:w="4451"/>
-            <w:tcMar>
-              <w:top w:w="60" w:type="dxa"/>
-              <w:bottom w:w="60" w:type="dxa"/>
-              <w:left w:w="100" w:type="dxa"/>
-              <w:right w:w="100" w:type="dxa"/>
-            </w:tcMar>
-            <w:shd w:val="clear" w:color="auto" w:fill="EBF5FB"/>
+            <w:tcW w:type="dxa" w:w="4680"/>
+          </w:tcPr>
+          <w:p>
+            <w:pPr>
+              <w:spacing w:before="40" w:after="40"/>
+            </w:pPr>
+            <w:r/>
+            <w:r>
+              <w:rPr>
+                <w:b w:val="0"/>
+                <w:i w:val="0"/>
+                <w:sz w:val="20"/>
+              </w:rPr>
+              <w:t>Seção 5; evidência consolidada em REG-OSW-001 §7</w:t>
+            </w:r>
+          </w:p>
+        </w:tc>
+      </w:tr>
+    </w:tbl>
+    <w:p/>
+    <w:p>
+      <w:pPr>
+        <w:pBdr>
+          <w:bottom w:val="single" w:sz="6" w:space="1" w:color="AAAAAA"/>
+        </w:pBdr>
+      </w:pPr>
+    </w:p>
+    <w:p>
+      <w:pPr>
+        <w:pStyle w:val="Heading2"/>
+      </w:pPr>
+      <w:r>
+        <w:rPr>
+          <w:b/>
+          <w:color w:val="2E74B5"/>
+          <w:sz w:val="26"/>
+        </w:rPr>
+        <w:t>Histórico de revisões</w:t>
+      </w:r>
+    </w:p>
+    <w:tbl>
+      <w:tblPr>
+        <w:tblStyle w:val="TableGrid"/>
+        <w:tblW w:type="auto" w:w="0"/>
+        <w:tblLook w:firstColumn="1" w:firstRow="1" w:lastColumn="0" w:lastRow="0" w:noHBand="0" w:noVBand="1" w:val="04A0"/>
+      </w:tblPr>
+      <w:tblGrid>
+        <w:gridCol w:w="2340"/>
+        <w:gridCol w:w="2340"/>
+        <w:gridCol w:w="2340"/>
+        <w:gridCol w:w="2340"/>
+      </w:tblGrid>
+      <w:tr>
+        <w:tc>
+          <w:tcPr>
+            <w:tcW w:type="dxa" w:w="2340"/>
+            <w:shd w:val="clear" w:color="auto" w:fill="D6E4F7"/>
           </w:tcPr>
           <w:p>
             <w:pPr>
@@ -2076,76 +1735,11 @@
             </w:pPr>
             <w:r>
               <w:rPr>
-                <w:rFonts w:ascii="Calibri" w:hAnsi="Calibri"/>
-                <w:b w:val="0"/>
-                <w:i w:val="0"/>
-                <w:sz w:val="20"/>
+                <w:b/>
               </w:rPr>
-              <w:t>Seção 5</w:t>
             </w:r>
-          </w:p>
-        </w:tc>
-      </w:tr>
-    </w:tbl>
-    <w:p>
-      <w:pPr>
-        <w:spacing w:before="0" w:after="160"/>
-      </w:pPr>
-    </w:p>
-    <w:p>
-      <w:pPr>
-        <w:pStyle w:val="Heading1"/>
-        <w:keepNext/>
-        <w:keepLines/>
-        <w:pBdr>
-          <w:bottom w:val="single" w:sz="4" w:space="2" w:color="D6E4F0"/>
-        </w:pBdr>
-      </w:pPr>
-      <w:r>
-        <w:t>Histórico de revisões</w:t>
-      </w:r>
-    </w:p>
-    <w:tbl>
-      <w:tblPr>
-        <w:tblW w:type="auto" w:w="0"/>
-        <w:tblLook w:firstColumn="1" w:firstRow="1" w:lastColumn="0" w:lastRow="0" w:noHBand="0" w:noVBand="1" w:val="04A0"/>
-        <w:tblBorders>
-          <w:top w:val="single" w:sz="4" w:space="0" w:color="AAAAAA"/>
-          <w:left w:val="single" w:sz="4" w:space="0" w:color="AAAAAA"/>
-          <w:bottom w:val="single" w:sz="4" w:space="0" w:color="AAAAAA"/>
-          <w:right w:val="single" w:sz="4" w:space="0" w:color="AAAAAA"/>
-          <w:insideH w:val="single" w:sz="4" w:space="0" w:color="AAAAAA"/>
-          <w:insideV w:val="single" w:sz="4" w:space="0" w:color="AAAAAA"/>
-        </w:tblBorders>
-      </w:tblPr>
-      <w:tblGrid>
-        <w:gridCol w:w="2225"/>
-        <w:gridCol w:w="2225"/>
-        <w:gridCol w:w="2225"/>
-        <w:gridCol w:w="2225"/>
-      </w:tblGrid>
-      <w:tr>
-        <w:trPr>
-          <w:cantSplit w:val="1"/>
-        </w:trPr>
-        <w:tc>
-          <w:tcPr>
-            <w:tcW w:type="dxa" w:w="2225"/>
-            <w:tcMar>
-              <w:top w:w="60" w:type="dxa"/>
-              <w:bottom w:w="60" w:type="dxa"/>
-              <w:left w:w="100" w:type="dxa"/>
-              <w:right w:w="100" w:type="dxa"/>
-            </w:tcMar>
-            <w:shd w:val="clear" w:color="auto" w:fill="D6E4F0"/>
-          </w:tcPr>
-          <w:p>
-            <w:pPr>
-              <w:spacing w:before="40" w:after="40"/>
-            </w:pPr>
             <w:r>
               <w:rPr>
-                <w:rFonts w:ascii="Calibri" w:hAnsi="Calibri"/>
                 <w:b/>
                 <w:i w:val="0"/>
                 <w:sz w:val="20"/>
@@ -2156,14 +1750,8 @@
         </w:tc>
         <w:tc>
           <w:tcPr>
-            <w:tcW w:type="dxa" w:w="2225"/>
-            <w:tcMar>
-              <w:top w:w="60" w:type="dxa"/>
-              <w:bottom w:w="60" w:type="dxa"/>
-              <w:left w:w="100" w:type="dxa"/>
-              <w:right w:w="100" w:type="dxa"/>
-            </w:tcMar>
-            <w:shd w:val="clear" w:color="auto" w:fill="D6E4F0"/>
+            <w:tcW w:type="dxa" w:w="2340"/>
+            <w:shd w:val="clear" w:color="auto" w:fill="D6E4F7"/>
           </w:tcPr>
           <w:p>
             <w:pPr>
@@ -2171,7 +1759,11 @@
             </w:pPr>
             <w:r>
               <w:rPr>
-                <w:rFonts w:ascii="Calibri" w:hAnsi="Calibri"/>
+                <w:b/>
+              </w:rPr>
+            </w:r>
+            <w:r>
+              <w:rPr>
                 <w:b/>
                 <w:i w:val="0"/>
                 <w:sz w:val="20"/>
@@ -2182,14 +1774,8 @@
         </w:tc>
         <w:tc>
           <w:tcPr>
-            <w:tcW w:type="dxa" w:w="2225"/>
-            <w:tcMar>
-              <w:top w:w="60" w:type="dxa"/>
-              <w:bottom w:w="60" w:type="dxa"/>
-              <w:left w:w="100" w:type="dxa"/>
-              <w:right w:w="100" w:type="dxa"/>
-            </w:tcMar>
-            <w:shd w:val="clear" w:color="auto" w:fill="D6E4F0"/>
+            <w:tcW w:type="dxa" w:w="2340"/>
+            <w:shd w:val="clear" w:color="auto" w:fill="D6E4F7"/>
           </w:tcPr>
           <w:p>
             <w:pPr>
@@ -2197,7 +1783,11 @@
             </w:pPr>
             <w:r>
               <w:rPr>
-                <w:rFonts w:ascii="Calibri" w:hAnsi="Calibri"/>
+                <w:b/>
+              </w:rPr>
+            </w:r>
+            <w:r>
+              <w:rPr>
                 <w:b/>
                 <w:i w:val="0"/>
                 <w:sz w:val="20"/>
@@ -2208,14 +1798,8 @@
         </w:tc>
         <w:tc>
           <w:tcPr>
-            <w:tcW w:type="dxa" w:w="2225"/>
-            <w:tcMar>
-              <w:top w:w="60" w:type="dxa"/>
-              <w:bottom w:w="60" w:type="dxa"/>
-              <w:left w:w="100" w:type="dxa"/>
-              <w:right w:w="100" w:type="dxa"/>
-            </w:tcMar>
-            <w:shd w:val="clear" w:color="auto" w:fill="D6E4F0"/>
+            <w:tcW w:type="dxa" w:w="2340"/>
+            <w:shd w:val="clear" w:color="auto" w:fill="D6E4F7"/>
           </w:tcPr>
           <w:p>
             <w:pPr>
@@ -2223,7 +1807,11 @@
             </w:pPr>
             <w:r>
               <w:rPr>
-                <w:rFonts w:ascii="Calibri" w:hAnsi="Calibri"/>
+                <w:b/>
+              </w:rPr>
+            </w:r>
+            <w:r>
+              <w:rPr>
                 <w:b/>
                 <w:i w:val="0"/>
                 <w:sz w:val="20"/>
@@ -2234,28 +1822,18 @@
         </w:tc>
       </w:tr>
       <w:tr>
-        <w:trPr>
-          <w:cantSplit w:val="1"/>
-        </w:trPr>
         <w:tc>
           <w:tcPr>
-            <w:tcW w:type="dxa" w:w="2225"/>
-            <w:tcMar>
-              <w:top w:w="60" w:type="dxa"/>
-              <w:bottom w:w="60" w:type="dxa"/>
-              <w:left w:w="100" w:type="dxa"/>
-              <w:right w:w="100" w:type="dxa"/>
-            </w:tcMar>
-            <w:shd w:val="clear" w:color="auto" w:fill="F0F4F8"/>
+            <w:tcW w:type="dxa" w:w="2340"/>
           </w:tcPr>
           <w:p>
             <w:pPr>
               <w:spacing w:before="40" w:after="40"/>
             </w:pPr>
+            <w:r/>
             <w:r>
               <w:rPr>
-                <w:rFonts w:ascii="Calibri" w:hAnsi="Calibri"/>
-                <w:b/>
+                <w:b w:val="0"/>
                 <w:i w:val="0"/>
                 <w:sz w:val="20"/>
               </w:rPr>
@@ -2265,21 +1843,15 @@
         </w:tc>
         <w:tc>
           <w:tcPr>
-            <w:tcW w:type="dxa" w:w="2225"/>
-            <w:tcMar>
-              <w:top w:w="60" w:type="dxa"/>
-              <w:bottom w:w="60" w:type="dxa"/>
-              <w:left w:w="100" w:type="dxa"/>
-              <w:right w:w="100" w:type="dxa"/>
-            </w:tcMar>
+            <w:tcW w:type="dxa" w:w="2340"/>
           </w:tcPr>
           <w:p>
             <w:pPr>
               <w:spacing w:before="40" w:after="40"/>
             </w:pPr>
+            <w:r/>
             <w:r>
               <w:rPr>
-                <w:rFonts w:ascii="Calibri" w:hAnsi="Calibri"/>
                 <w:b w:val="0"/>
                 <w:i w:val="0"/>
                 <w:sz w:val="20"/>
@@ -2290,21 +1862,15 @@
         </w:tc>
         <w:tc>
           <w:tcPr>
-            <w:tcW w:type="dxa" w:w="2225"/>
-            <w:tcMar>
-              <w:top w:w="60" w:type="dxa"/>
-              <w:bottom w:w="60" w:type="dxa"/>
-              <w:left w:w="100" w:type="dxa"/>
-              <w:right w:w="100" w:type="dxa"/>
-            </w:tcMar>
+            <w:tcW w:type="dxa" w:w="2340"/>
           </w:tcPr>
           <w:p>
             <w:pPr>
               <w:spacing w:before="40" w:after="40"/>
             </w:pPr>
+            <w:r/>
             <w:r>
               <w:rPr>
-                <w:rFonts w:ascii="Calibri" w:hAnsi="Calibri"/>
                 <w:b w:val="0"/>
                 <w:i w:val="0"/>
                 <w:sz w:val="20"/>
@@ -2315,21 +1881,15 @@
         </w:tc>
         <w:tc>
           <w:tcPr>
-            <w:tcW w:type="dxa" w:w="2225"/>
-            <w:tcMar>
-              <w:top w:w="60" w:type="dxa"/>
-              <w:bottom w:w="60" w:type="dxa"/>
-              <w:left w:w="100" w:type="dxa"/>
-              <w:right w:w="100" w:type="dxa"/>
-            </w:tcMar>
+            <w:tcW w:type="dxa" w:w="2340"/>
           </w:tcPr>
           <w:p>
             <w:pPr>
               <w:spacing w:before="40" w:after="40"/>
             </w:pPr>
+            <w:r/>
             <w:r>
               <w:rPr>
-                <w:rFonts w:ascii="Calibri" w:hAnsi="Calibri"/>
                 <w:b w:val="0"/>
                 <w:i w:val="0"/>
                 <w:sz w:val="20"/>
@@ -2340,28 +1900,18 @@
         </w:tc>
       </w:tr>
       <w:tr>
-        <w:trPr>
-          <w:cantSplit w:val="1"/>
-        </w:trPr>
         <w:tc>
           <w:tcPr>
-            <w:tcW w:type="dxa" w:w="2225"/>
-            <w:tcMar>
-              <w:top w:w="60" w:type="dxa"/>
-              <w:bottom w:w="60" w:type="dxa"/>
-              <w:left w:w="100" w:type="dxa"/>
-              <w:right w:w="100" w:type="dxa"/>
-            </w:tcMar>
-            <w:shd w:val="clear" w:color="auto" w:fill="F0F4F8"/>
+            <w:tcW w:type="dxa" w:w="2340"/>
           </w:tcPr>
           <w:p>
             <w:pPr>
               <w:spacing w:before="40" w:after="40"/>
             </w:pPr>
+            <w:r/>
             <w:r>
               <w:rPr>
-                <w:rFonts w:ascii="Calibri" w:hAnsi="Calibri"/>
-                <w:b/>
+                <w:b w:val="0"/>
                 <w:i w:val="0"/>
                 <w:sz w:val="20"/>
               </w:rPr>
@@ -2371,21 +1921,15 @@
         </w:tc>
         <w:tc>
           <w:tcPr>
-            <w:tcW w:type="dxa" w:w="2225"/>
-            <w:tcMar>
-              <w:top w:w="60" w:type="dxa"/>
-              <w:bottom w:w="60" w:type="dxa"/>
-              <w:left w:w="100" w:type="dxa"/>
-              <w:right w:w="100" w:type="dxa"/>
-            </w:tcMar>
+            <w:tcW w:type="dxa" w:w="2340"/>
           </w:tcPr>
           <w:p>
             <w:pPr>
               <w:spacing w:before="40" w:after="40"/>
             </w:pPr>
+            <w:r/>
             <w:r>
               <w:rPr>
-                <w:rFonts w:ascii="Calibri" w:hAnsi="Calibri"/>
                 <w:b w:val="0"/>
                 <w:i w:val="0"/>
                 <w:sz w:val="20"/>
@@ -2396,21 +1940,15 @@
         </w:tc>
         <w:tc>
           <w:tcPr>
-            <w:tcW w:type="dxa" w:w="2225"/>
-            <w:tcMar>
-              <w:top w:w="60" w:type="dxa"/>
-              <w:bottom w:w="60" w:type="dxa"/>
-              <w:left w:w="100" w:type="dxa"/>
-              <w:right w:w="100" w:type="dxa"/>
-            </w:tcMar>
+            <w:tcW w:type="dxa" w:w="2340"/>
           </w:tcPr>
           <w:p>
             <w:pPr>
               <w:spacing w:before="40" w:after="40"/>
             </w:pPr>
+            <w:r/>
             <w:r>
               <w:rPr>
-                <w:rFonts w:ascii="Calibri" w:hAnsi="Calibri"/>
                 <w:b w:val="0"/>
                 <w:i w:val="0"/>
                 <w:sz w:val="20"/>
@@ -2421,21 +1959,15 @@
         </w:tc>
         <w:tc>
           <w:tcPr>
-            <w:tcW w:type="dxa" w:w="2225"/>
-            <w:tcMar>
-              <w:top w:w="60" w:type="dxa"/>
-              <w:bottom w:w="60" w:type="dxa"/>
-              <w:left w:w="100" w:type="dxa"/>
-              <w:right w:w="100" w:type="dxa"/>
-            </w:tcMar>
+            <w:tcW w:type="dxa" w:w="2340"/>
           </w:tcPr>
           <w:p>
             <w:pPr>
               <w:spacing w:before="40" w:after="40"/>
             </w:pPr>
+            <w:r/>
             <w:r>
               <w:rPr>
-                <w:rFonts w:ascii="Calibri" w:hAnsi="Calibri"/>
                 <w:b w:val="0"/>
                 <w:i w:val="0"/>
                 <w:sz w:val="20"/>
@@ -2446,28 +1978,18 @@
         </w:tc>
       </w:tr>
       <w:tr>
-        <w:trPr>
-          <w:cantSplit w:val="1"/>
-        </w:trPr>
         <w:tc>
           <w:tcPr>
-            <w:tcW w:type="dxa" w:w="2225"/>
-            <w:tcMar>
-              <w:top w:w="60" w:type="dxa"/>
-              <w:bottom w:w="60" w:type="dxa"/>
-              <w:left w:w="100" w:type="dxa"/>
-              <w:right w:w="100" w:type="dxa"/>
-            </w:tcMar>
-            <w:shd w:val="clear" w:color="auto" w:fill="F0F4F8"/>
+            <w:tcW w:type="dxa" w:w="2340"/>
           </w:tcPr>
           <w:p>
             <w:pPr>
               <w:spacing w:before="40" w:after="40"/>
             </w:pPr>
+            <w:r/>
             <w:r>
               <w:rPr>
-                <w:rFonts w:ascii="Calibri" w:hAnsi="Calibri"/>
-                <w:b/>
+                <w:b w:val="0"/>
                 <w:i w:val="0"/>
                 <w:sz w:val="20"/>
               </w:rPr>
@@ -2477,21 +1999,15 @@
         </w:tc>
         <w:tc>
           <w:tcPr>
-            <w:tcW w:type="dxa" w:w="2225"/>
-            <w:tcMar>
-              <w:top w:w="60" w:type="dxa"/>
-              <w:bottom w:w="60" w:type="dxa"/>
-              <w:left w:w="100" w:type="dxa"/>
-              <w:right w:w="100" w:type="dxa"/>
-            </w:tcMar>
+            <w:tcW w:type="dxa" w:w="2340"/>
           </w:tcPr>
           <w:p>
             <w:pPr>
               <w:spacing w:before="40" w:after="40"/>
             </w:pPr>
+            <w:r/>
             <w:r>
               <w:rPr>
-                <w:rFonts w:ascii="Calibri" w:hAnsi="Calibri"/>
                 <w:b w:val="0"/>
                 <w:i w:val="0"/>
                 <w:sz w:val="20"/>
@@ -2502,21 +2018,15 @@
         </w:tc>
         <w:tc>
           <w:tcPr>
-            <w:tcW w:type="dxa" w:w="2225"/>
-            <w:tcMar>
-              <w:top w:w="60" w:type="dxa"/>
-              <w:bottom w:w="60" w:type="dxa"/>
-              <w:left w:w="100" w:type="dxa"/>
-              <w:right w:w="100" w:type="dxa"/>
-            </w:tcMar>
+            <w:tcW w:type="dxa" w:w="2340"/>
           </w:tcPr>
           <w:p>
             <w:pPr>
               <w:spacing w:before="40" w:after="40"/>
             </w:pPr>
+            <w:r/>
             <w:r>
               <w:rPr>
-                <w:rFonts w:ascii="Calibri" w:hAnsi="Calibri"/>
                 <w:b w:val="0"/>
                 <w:i w:val="0"/>
                 <w:sz w:val="20"/>
@@ -2527,21 +2037,15 @@
         </w:tc>
         <w:tc>
           <w:tcPr>
-            <w:tcW w:type="dxa" w:w="2225"/>
-            <w:tcMar>
-              <w:top w:w="60" w:type="dxa"/>
-              <w:bottom w:w="60" w:type="dxa"/>
-              <w:left w:w="100" w:type="dxa"/>
-              <w:right w:w="100" w:type="dxa"/>
-            </w:tcMar>
+            <w:tcW w:type="dxa" w:w="2340"/>
           </w:tcPr>
           <w:p>
             <w:pPr>
               <w:spacing w:before="40" w:after="40"/>
             </w:pPr>
+            <w:r/>
             <w:r>
               <w:rPr>
-                <w:rFonts w:ascii="Calibri" w:hAnsi="Calibri"/>
                 <w:b w:val="0"/>
                 <w:i w:val="0"/>
                 <w:sz w:val="20"/>
@@ -2551,204 +2055,94 @@
           </w:p>
         </w:tc>
       </w:tr>
+      <w:tr>
+        <w:tc>
+          <w:tcPr>
+            <w:tcW w:type="dxa" w:w="2340"/>
+          </w:tcPr>
+          <w:p>
+            <w:pPr>
+              <w:spacing w:before="40" w:after="40"/>
+            </w:pPr>
+            <w:r/>
+            <w:r>
+              <w:rPr>
+                <w:b w:val="0"/>
+                <w:i w:val="0"/>
+                <w:sz w:val="20"/>
+              </w:rPr>
+              <w:t>1.3</w:t>
+            </w:r>
+          </w:p>
+        </w:tc>
+        <w:tc>
+          <w:tcPr>
+            <w:tcW w:type="dxa" w:w="2340"/>
+          </w:tcPr>
+          <w:p>
+            <w:pPr>
+              <w:spacing w:before="40" w:after="40"/>
+            </w:pPr>
+            <w:r/>
+            <w:r>
+              <w:rPr>
+                <w:b w:val="0"/>
+                <w:i w:val="0"/>
+                <w:sz w:val="20"/>
+              </w:rPr>
+              <w:t>13/06/2026</w:t>
+            </w:r>
+          </w:p>
+        </w:tc>
+        <w:tc>
+          <w:tcPr>
+            <w:tcW w:type="dxa" w:w="2340"/>
+          </w:tcPr>
+          <w:p>
+            <w:pPr>
+              <w:spacing w:before="40" w:after="40"/>
+            </w:pPr>
+            <w:r/>
+            <w:r>
+              <w:rPr>
+                <w:b w:val="0"/>
+                <w:i w:val="0"/>
+                <w:sz w:val="20"/>
+              </w:rPr>
+              <w:t>Time de Melhoria Contínua</w:t>
+            </w:r>
+          </w:p>
+        </w:tc>
+        <w:tc>
+          <w:tcPr>
+            <w:tcW w:type="dxa" w:w="2340"/>
+          </w:tcPr>
+          <w:p>
+            <w:pPr>
+              <w:spacing w:before="40" w:after="40"/>
+            </w:pPr>
+            <w:r/>
+            <w:r>
+              <w:rPr>
+                <w:b w:val="0"/>
+                <w:i w:val="0"/>
+                <w:sz w:val="20"/>
+              </w:rPr>
+              <w:t>Referência ao Painel de Portfólio (REG-OSW-001) como registro consolidado do acompanhamento (§5, §7 e §8 de rastreabilidade)</w:t>
+            </w:r>
+          </w:p>
+        </w:tc>
+      </w:tr>
     </w:tbl>
-    <w:p>
-      <w:pPr>
-        <w:spacing w:before="0" w:after="160"/>
-      </w:pPr>
-    </w:p>
+    <w:p/>
     <w:sectPr>
-      <w:headerReference w:type="default" r:id="rId9"/>
-      <w:headerReference w:type="first" r:id="rId10"/>
-      <w:footerReference w:type="default" r:id="rId11"/>
-      <w:footerReference w:type="first" r:id="rId12"/>
-      <w:pgSz w:w="11906" w:h="16838"/>
-      <w:pgMar w:top="1587" w:right="1417" w:bottom="1417" w:left="1587" w:header="720" w:footer="720" w:gutter="0"/>
+      <w:pgSz w:w="12240" w:h="15840"/>
+      <w:pgMar w:top="1440" w:right="1440" w:bottom="1440" w:left="1440" w:header="720" w:footer="720" w:gutter="0"/>
       <w:cols w:space="720"/>
-      <w:titlePg/>
       <w:docGrid w:linePitch="360"/>
     </w:sectPr>
   </w:body>
 </w:document>
-</file>
-
-<file path=word/footer1.xml><?xml version="1.0" encoding="utf-8"?>
-<w:ftr xmlns:m="http://schemas.openxmlformats.org/officeDocument/2006/math" xmlns:mc="http://schemas.openxmlformats.org/markup-compatibility/2006" xmlns:mo="http://schemas.microsoft.com/office/mac/office/2008/main" xmlns:mv="urn:schemas-microsoft-com:mac:vml" xmlns:o="urn:schemas-microsoft-com:office:office" xmlns:r="http://schemas.openxmlformats.org/officeDocument/2006/relationships" xmlns:v="urn:schemas-microsoft-com:vml" xmlns:w10="urn:schemas-microsoft-com:office:word" xmlns:w14="http://schemas.microsoft.com/office/word/2010/wordml" xmlns:w="http://schemas.openxmlformats.org/wordprocessingml/2006/main" xmlns:wne="http://schemas.microsoft.com/office/word/2006/wordml" xmlns:wp14="http://schemas.microsoft.com/office/word/2010/wordprocessingDrawing" xmlns:wp="http://schemas.openxmlformats.org/drawingml/2006/wordprocessingDrawing" xmlns:wpc="http://schemas.microsoft.com/office/word/2010/wordprocessingCanvas" xmlns:wpg="http://schemas.microsoft.com/office/word/2010/wordprocessingGroup" xmlns:wpi="http://schemas.microsoft.com/office/word/2010/wordprocessingInk" xmlns:wps="http://schemas.microsoft.com/office/word/2010/wordprocessingShape" mc:Ignorable="w14 wp14">
-  <w:p>
-    <w:pPr>
-      <w:pStyle w:val="Footer"/>
-      <w:tabs>
-        <w:tab w:val="right" w:pos="8901"/>
-      </w:tabs>
-      <w:pBdr>
-        <w:top w:val="single" w:sz="4" w:space="4" w:color="003366"/>
-      </w:pBdr>
-      <w:spacing w:before="80" w:after="0"/>
-    </w:pPr>
-    <w:r>
-      <w:rPr>
-        <w:rFonts w:ascii="Calibri" w:hAnsi="Calibri"/>
-        <w:color w:val="555555"/>
-        <w:sz w:val="16"/>
-      </w:rPr>
-      <w:t>vData  ·  20/03/2026</w:t>
-    </w:r>
-    <w:r>
-      <w:tab/>
-    </w:r>
-    <w:r>
-      <w:rPr>
-        <w:rFonts w:ascii="Calibri" w:hAnsi="Calibri"/>
-        <w:color w:val="555555"/>
-        <w:sz w:val="16"/>
-      </w:rPr>
-      <w:t xml:space="preserve">Página </w:t>
-    </w:r>
-    <w:r>
-      <w:rPr>
-        <w:rFonts w:ascii="Calibri" w:hAnsi="Calibri"/>
-        <w:sz w:val="16"/>
-      </w:rPr>
-      <w:fldChar w:fldCharType="begin"/>
-      <w:instrText xml:space="preserve"> PAGE </w:instrText>
-      <w:fldChar w:fldCharType="end"/>
-    </w:r>
-    <w:r>
-      <w:rPr>
-        <w:rFonts w:ascii="Calibri" w:hAnsi="Calibri"/>
-        <w:color w:val="555555"/>
-        <w:sz w:val="16"/>
-      </w:rPr>
-      <w:t xml:space="preserve"> de </w:t>
-    </w:r>
-    <w:r>
-      <w:rPr>
-        <w:rFonts w:ascii="Calibri" w:hAnsi="Calibri"/>
-        <w:sz w:val="16"/>
-      </w:rPr>
-      <w:fldChar w:fldCharType="begin"/>
-      <w:instrText xml:space="preserve"> NUMPAGES </w:instrText>
-      <w:fldChar w:fldCharType="end"/>
-    </w:r>
-  </w:p>
-</w:ftr>
-</file>
-
-<file path=word/footer2.xml><?xml version="1.0" encoding="utf-8"?>
-<w:ftr xmlns:m="http://schemas.openxmlformats.org/officeDocument/2006/math" xmlns:mc="http://schemas.openxmlformats.org/markup-compatibility/2006" xmlns:mo="http://schemas.microsoft.com/office/mac/office/2008/main" xmlns:mv="urn:schemas-microsoft-com:mac:vml" xmlns:o="urn:schemas-microsoft-com:office:office" xmlns:r="http://schemas.openxmlformats.org/officeDocument/2006/relationships" xmlns:v="urn:schemas-microsoft-com:vml" xmlns:w10="urn:schemas-microsoft-com:office:word" xmlns:w14="http://schemas.microsoft.com/office/word/2010/wordml" xmlns:w="http://schemas.openxmlformats.org/wordprocessingml/2006/main" xmlns:wne="http://schemas.microsoft.com/office/word/2006/wordml" xmlns:wp14="http://schemas.microsoft.com/office/word/2010/wordprocessingDrawing" xmlns:wp="http://schemas.openxmlformats.org/drawingml/2006/wordprocessingDrawing" xmlns:wpc="http://schemas.microsoft.com/office/word/2010/wordprocessingCanvas" xmlns:wpg="http://schemas.microsoft.com/office/word/2010/wordprocessingGroup" xmlns:wpi="http://schemas.microsoft.com/office/word/2010/wordprocessingInk" xmlns:wps="http://schemas.microsoft.com/office/word/2010/wordprocessingShape" mc:Ignorable="w14 wp14">
-  <w:p>
-    <w:pPr>
-      <w:pStyle w:val="Footer"/>
-      <w:tabs>
-        <w:tab w:val="right" w:pos="8901"/>
-      </w:tabs>
-      <w:pBdr>
-        <w:top w:val="single" w:sz="4" w:space="4" w:color="003366"/>
-      </w:pBdr>
-      <w:spacing w:before="80" w:after="0"/>
-    </w:pPr>
-    <w:r>
-      <w:rPr>
-        <w:rFonts w:ascii="Calibri" w:hAnsi="Calibri"/>
-        <w:color w:val="555555"/>
-        <w:sz w:val="16"/>
-      </w:rPr>
-      <w:t>vData  ·  20/03/2026</w:t>
-    </w:r>
-    <w:r>
-      <w:tab/>
-    </w:r>
-    <w:r>
-      <w:rPr>
-        <w:rFonts w:ascii="Calibri" w:hAnsi="Calibri"/>
-        <w:color w:val="555555"/>
-        <w:sz w:val="16"/>
-      </w:rPr>
-      <w:t xml:space="preserve">Página </w:t>
-    </w:r>
-    <w:r>
-      <w:rPr>
-        <w:rFonts w:ascii="Calibri" w:hAnsi="Calibri"/>
-        <w:sz w:val="16"/>
-      </w:rPr>
-      <w:fldChar w:fldCharType="begin"/>
-      <w:instrText xml:space="preserve"> PAGE </w:instrText>
-      <w:fldChar w:fldCharType="end"/>
-    </w:r>
-    <w:r>
-      <w:rPr>
-        <w:rFonts w:ascii="Calibri" w:hAnsi="Calibri"/>
-        <w:color w:val="555555"/>
-        <w:sz w:val="16"/>
-      </w:rPr>
-      <w:t xml:space="preserve"> de </w:t>
-    </w:r>
-    <w:r>
-      <w:rPr>
-        <w:rFonts w:ascii="Calibri" w:hAnsi="Calibri"/>
-        <w:sz w:val="16"/>
-      </w:rPr>
-      <w:fldChar w:fldCharType="begin"/>
-      <w:instrText xml:space="preserve"> NUMPAGES </w:instrText>
-      <w:fldChar w:fldCharType="end"/>
-    </w:r>
-  </w:p>
-</w:ftr>
-</file>
-
-<file path=word/header1.xml><?xml version="1.0" encoding="utf-8"?>
-<w:hdr xmlns:m="http://schemas.openxmlformats.org/officeDocument/2006/math" xmlns:mc="http://schemas.openxmlformats.org/markup-compatibility/2006" xmlns:mo="http://schemas.microsoft.com/office/mac/office/2008/main" xmlns:mv="urn:schemas-microsoft-com:mac:vml" xmlns:o="urn:schemas-microsoft-com:office:office" xmlns:r="http://schemas.openxmlformats.org/officeDocument/2006/relationships" xmlns:v="urn:schemas-microsoft-com:vml" xmlns:w10="urn:schemas-microsoft-com:office:word" xmlns:w14="http://schemas.microsoft.com/office/word/2010/wordml" xmlns:w="http://schemas.openxmlformats.org/wordprocessingml/2006/main" xmlns:wne="http://schemas.microsoft.com/office/word/2006/wordml" xmlns:wp14="http://schemas.microsoft.com/office/word/2010/wordprocessingDrawing" xmlns:wp="http://schemas.openxmlformats.org/drawingml/2006/wordprocessingDrawing" xmlns:wpc="http://schemas.microsoft.com/office/word/2010/wordprocessingCanvas" xmlns:wpg="http://schemas.microsoft.com/office/word/2010/wordprocessingGroup" xmlns:wpi="http://schemas.microsoft.com/office/word/2010/wordprocessingInk" xmlns:wps="http://schemas.microsoft.com/office/word/2010/wordprocessingShape" mc:Ignorable="w14 wp14">
-  <w:p>
-    <w:pPr>
-      <w:pStyle w:val="Header"/>
-      <w:tabs>
-        <w:tab w:val="right" w:pos="8901"/>
-      </w:tabs>
-      <w:pBdr>
-        <w:bottom w:val="single" w:sz="8" w:space="4" w:color="003366"/>
-      </w:pBdr>
-      <w:spacing w:before="0" w:after="80"/>
-    </w:pPr>
-    <w:r>
-      <w:rPr>
-        <w:rFonts w:ascii="Calibri" w:hAnsi="Calibri"/>
-        <w:b/>
-        <w:color w:val="003366"/>
-        <w:sz w:val="18"/>
-      </w:rPr>
-      <w:t>TIMEWARE</w:t>
-    </w:r>
-    <w:r>
-      <w:rPr>
-        <w:rFonts w:ascii="Calibri" w:hAnsi="Calibri"/>
-        <w:color w:val="555555"/>
-        <w:sz w:val="18"/>
-      </w:rPr>
-      <w:t xml:space="preserve">   ·   PRO-OSW-002</w:t>
-    </w:r>
-    <w:r>
-      <w:tab/>
-    </w:r>
-    <w:r>
-      <w:rPr>
-        <w:rFonts w:ascii="Calibri" w:hAnsi="Calibri"/>
-        <w:color w:val="555555"/>
-        <w:sz w:val="18"/>
-      </w:rPr>
-      <w:t>Gerência Organizacional de Software</w:t>
-    </w:r>
-  </w:p>
-</w:hdr>
-</file>
-
-<file path=word/header2.xml><?xml version="1.0" encoding="utf-8"?>
-<w:hdr xmlns:m="http://schemas.openxmlformats.org/officeDocument/2006/math" xmlns:mc="http://schemas.openxmlformats.org/markup-compatibility/2006" xmlns:mo="http://schemas.microsoft.com/office/mac/office/2008/main" xmlns:mv="urn:schemas-microsoft-com:mac:vml" xmlns:o="urn:schemas-microsoft-com:office:office" xmlns:r="http://schemas.openxmlformats.org/officeDocument/2006/relationships" xmlns:v="urn:schemas-microsoft-com:vml" xmlns:w10="urn:schemas-microsoft-com:office:word" xmlns:w14="http://schemas.microsoft.com/office/word/2010/wordml" xmlns:w="http://schemas.openxmlformats.org/wordprocessingml/2006/main" xmlns:wne="http://schemas.microsoft.com/office/word/2006/wordml" xmlns:wp14="http://schemas.microsoft.com/office/word/2010/wordprocessingDrawing" xmlns:wp="http://schemas.openxmlformats.org/drawingml/2006/wordprocessingDrawing" xmlns:wpc="http://schemas.microsoft.com/office/word/2010/wordprocessingCanvas" xmlns:wpg="http://schemas.microsoft.com/office/word/2010/wordprocessingGroup" xmlns:wpi="http://schemas.microsoft.com/office/word/2010/wordprocessingInk" xmlns:wps="http://schemas.microsoft.com/office/word/2010/wordprocessingShape" mc:Ignorable="w14 wp14">
-  <w:p>
-    <w:pPr>
-      <w:pStyle w:val="Header"/>
-    </w:pPr>
-  </w:p>
-</w:hdr>
 </file>
 
 <file path=word/numbering.xml><?xml version="1.0" encoding="utf-8"?>
@@ -3114,12 +2508,9 @@
     <w:name w:val="Normal"/>
     <w:qFormat/>
     <w:rsid w:val="00FC693F"/>
-    <w:pPr>
-      <w:spacing w:after="120" w:lineRule="auto" w:line="276"/>
-    </w:pPr>
     <w:rPr>
       <w:rFonts w:ascii="Calibri" w:hAnsi="Calibri"/>
-      <w:sz w:val="22"/>
+      <w:sz w:val="20"/>
     </w:rPr>
   </w:style>
   <w:style w:type="paragraph" w:styleId="Header">
@@ -3177,15 +2568,15 @@
     <w:pPr>
       <w:keepNext/>
       <w:keepLines/>
-      <w:spacing w:before="360" w:after="120"/>
+      <w:spacing w:before="480" w:after="0"/>
       <w:outlineLvl w:val="0"/>
     </w:pPr>
     <w:rPr>
-      <w:rFonts w:asciiTheme="majorHAnsi" w:eastAsiaTheme="majorEastAsia" w:hAnsiTheme="majorHAnsi" w:cstheme="majorBidi" w:ascii="Calibri" w:hAnsi="Calibri"/>
+      <w:rFonts w:asciiTheme="majorHAnsi" w:eastAsiaTheme="majorEastAsia" w:hAnsiTheme="majorHAnsi" w:cstheme="majorBidi"/>
       <w:b/>
       <w:bCs/>
-      <w:color w:val="003366"/>
-      <w:sz w:val="26"/>
+      <w:color w:val="365F91" w:themeColor="accent1" w:themeShade="BF"/>
+      <w:sz w:val="28"/>
       <w:szCs w:val="28"/>
     </w:rPr>
   </w:style>
@@ -3201,15 +2592,15 @@
     <w:pPr>
       <w:keepNext/>
       <w:keepLines/>
-      <w:spacing w:before="240" w:after="80"/>
+      <w:spacing w:before="200" w:after="0"/>
       <w:outlineLvl w:val="1"/>
     </w:pPr>
     <w:rPr>
-      <w:rFonts w:asciiTheme="majorHAnsi" w:eastAsiaTheme="majorEastAsia" w:hAnsiTheme="majorHAnsi" w:cstheme="majorBidi" w:ascii="Calibri" w:hAnsi="Calibri"/>
+      <w:rFonts w:asciiTheme="majorHAnsi" w:eastAsiaTheme="majorEastAsia" w:hAnsiTheme="majorHAnsi" w:cstheme="majorBidi"/>
       <w:b/>
       <w:bCs/>
-      <w:color w:val="1A5276"/>
-      <w:sz w:val="22"/>
+      <w:color w:val="4F81BD" w:themeColor="accent1"/>
+      <w:sz w:val="26"/>
       <w:szCs w:val="26"/>
     </w:rPr>
   </w:style>
@@ -3225,16 +2616,14 @@
     <w:pPr>
       <w:keepNext/>
       <w:keepLines/>
-      <w:spacing w:before="160" w:after="40"/>
+      <w:spacing w:before="200" w:after="0"/>
       <w:outlineLvl w:val="2"/>
     </w:pPr>
     <w:rPr>
-      <w:rFonts w:asciiTheme="majorHAnsi" w:eastAsiaTheme="majorEastAsia" w:hAnsiTheme="majorHAnsi" w:cstheme="majorBidi" w:ascii="Calibri" w:hAnsi="Calibri"/>
+      <w:rFonts w:asciiTheme="majorHAnsi" w:eastAsiaTheme="majorEastAsia" w:hAnsiTheme="majorHAnsi" w:cstheme="majorBidi"/>
       <w:b/>
       <w:bCs/>
-      <w:i/>
-      <w:color w:val="1A5276"/>
-      <w:sz w:val="22"/>
+      <w:color w:val="4F81BD" w:themeColor="accent1"/>
     </w:rPr>
   </w:style>
   <w:style w:type="paragraph" w:styleId="Heading4">

</xml_diff>